<commit_message>
Word copy: skip font-mapping input when flattening
</commit_message>
<xml_diff>
--- a/manuscript_ipm/latex/manuscript.docx
+++ b/manuscript_ipm/latex/manuscript.docx
@@ -2125,7 +2125,7 @@
         </w:numPr>
       </w:pPr>
       <w:r>
-        <w:t xml:space="preserve">Measured encoding cost of each encoder on a free GPU, with five repetitions, and a public record of every deviation and failed run (Sections </w:t>
+        <w:t xml:space="preserve">Measured encoding cost of each encoder on a free GPU, with five repetitions, and a full record of every deviation and failed run (Sections </w:t>
       </w:r>
       <w:hyperlink w:anchor="sec:res-cost">
         <w:r>
@@ -4748,7 +4748,21 @@
         <w:t xml:space="preserve"> </w:t>
       </w:r>
       <w:r>
-        <w:t xml:space="preserve">by normalised question text. The join matched 2,255 queries; 1,197 had no match and none had more than one. All 2,255 joined queries form the NQ generation set.</w:t>
+        <w:t xml:space="preserve">by normalised question text. The join matched 2,255 queries; 1,197 had no match and none had more than one. All 2,255 joined queries form the NQ generation set. Table </w:t>
+      </w:r>
+      <w:hyperlink w:anchor="tab:data">
+        <w:r>
+          <w:rPr>
+            <w:rStyle w:val="Hyperlink"/>
+          </w:rPr>
+          <w:t xml:space="preserve">9</w:t>
+        </w:r>
+      </w:hyperlink>
+      <w:r>
+        <w:t xml:space="preserve"> </w:t>
+      </w:r>
+      <w:r>
+        <w:t xml:space="preserve">in the appendix summarises both datasets and sub-corpora.</w:t>
       </w:r>
     </w:p>
     <w:bookmarkEnd w:id="32"/>
@@ -4800,7 +4814,7 @@
         <w:t xml:space="preserve">)</w:t>
       </w:r>
       <w:r>
-        <w:t xml:space="preserve">: 7,405 judged test queries, two gold passages per query, and a corpus of 5,233,329 passages. Answers come from the fullwiki validation release, joined by question id; all queries matched. The generation set is the leading 2,000 queries of a seeded order (1616 bridge and 384 comparison questions).</w:t>
+        <w:t xml:space="preserve">: 7,405 judged test queries, two gold passages per query, and a corpus of 5,233,329 passages. Answers come from the fullwiki validation release, joined by question id; all queries matched. The generation set is the leading 2,000 queries of a seeded order (1,616 bridge and 384 comparison questions).</w:t>
       </w:r>
     </w:p>
     <w:bookmarkEnd w:id="33"/>
@@ -5727,7 +5741,7 @@
           <w:rPr>
             <w:rStyle w:val="Hyperlink"/>
           </w:rPr>
-          <w:t xml:space="preserve">11</w:t>
+          <w:t xml:space="preserve">12</w:t>
         </w:r>
       </w:hyperlink>
       <w:r>
@@ -6505,19 +6519,19 @@
       <w:r>
         <w:t xml:space="preserve">Table </w:t>
       </w:r>
-      <w:hyperlink w:anchor="tab:main">
+      <w:hyperlink w:anchor="tab:retrieval">
         <w:r>
           <w:rPr>
             <w:rStyle w:val="Hyperlink"/>
           </w:rPr>
-          <w:t xml:space="preserve">[tab:main]</w:t>
+          <w:t xml:space="preserve">[tab:retrieval]</w:t>
         </w:r>
       </w:hyperlink>
       <w:r>
         <w:t xml:space="preserve"> </w:t>
       </w:r>
       <w:r>
-        <w:t xml:space="preserve">gives Hit@5 on the generation queries; Table </w:t>
+        <w:t xml:space="preserve">gives retrieval quality on the generation queries, and Table </w:t>
       </w:r>
       <w:hyperlink w:anchor="tab:ci">
         <w:r>
@@ -6545,7 +6559,7 @@
         <w:t xml:space="preserve"> </w:t>
       </w:r>
       <w:r>
-        <w:t xml:space="preserve">adds Hit@1, Hit@10, nDCG@10 and MRR@10, and Fig. </w:t>
+        <w:t xml:space="preserve">also gives Hit@1, Hit@10, nDCG@10 and MRR@10, and Fig. </w:t>
       </w:r>
       <w:hyperlink w:anchor="fig:retrieval">
         <w:r>
@@ -7979,7 +7993,7 @@
       <w:r>
         <w:drawing>
           <wp:inline>
-            <wp:extent cx="5334000" cy="1782362"/>
+            <wp:extent cx="5334000" cy="1897522"/>
             <wp:effectExtent b="0" l="0" r="0" t="0"/>
             <wp:docPr descr="" title="" id="67" name="Picture"/>
             <a:graphic>
@@ -8000,7 +8014,7 @@
                   <pic:spPr bwMode="auto">
                     <a:xfrm>
                       <a:off x="0" y="0"/>
-                      <a:ext cx="5334000" cy="1782362"/>
+                      <a:ext cx="5334000" cy="1897522"/>
                     </a:xfrm>
                     <a:prstGeom prst="rect">
                       <a:avLst/>
@@ -10166,11 +10180,11 @@
           <w:rPr>
             <w:rStyle w:val="Hyperlink"/>
           </w:rPr>
-          <w:t xml:space="preserve">9</w:t>
+          <w:t xml:space="preserve">10</w:t>
         </w:r>
       </w:hyperlink>
       <w:r>
-        <w:t xml:space="preserve">) supports the reading that NQ</w:t>
+        <w:t xml:space="preserve">) is consistent with the reading that NQ</w:t>
       </w:r>
       <w:r>
         <w:t xml:space="preserve"> </w:t>
@@ -10888,7 +10902,90 @@
         <w:t xml:space="preserve"> </w:t>
       </w:r>
       <w:r>
-        <w:t xml:space="preserve">only.</w:t>
+        <w:t xml:space="preserve">only. More passages also cost more reading: the mean prompt grew from 210 tokens at</w:t>
+      </w:r>
+      <w:r>
+        <w:t xml:space="preserve"> </w:t>
+      </w:r>
+      <m:oMath>
+        <m:r>
+          <m:t>k</m:t>
+        </m:r>
+        <m:r>
+          <m:rPr>
+            <m:sty m:val="p"/>
+          </m:rPr>
+          <m:t>=</m:t>
+        </m:r>
+        <m:r>
+          <m:t>1</m:t>
+        </m:r>
+      </m:oMath>
+      <w:r>
+        <w:t xml:space="preserve"> </w:t>
+      </w:r>
+      <w:r>
+        <w:t xml:space="preserve">to 738 at</w:t>
+      </w:r>
+      <w:r>
+        <w:t xml:space="preserve"> </w:t>
+      </w:r>
+      <m:oMath>
+        <m:r>
+          <m:t>k</m:t>
+        </m:r>
+        <m:r>
+          <m:rPr>
+            <m:sty m:val="p"/>
+          </m:rPr>
+          <m:t>=</m:t>
+        </m:r>
+        <m:r>
+          <m:t>5</m:t>
+        </m:r>
+      </m:oMath>
+      <w:r>
+        <w:t xml:space="preserve"> </w:t>
+      </w:r>
+      <w:r>
+        <w:t xml:space="preserve">and 1,414 at</w:t>
+      </w:r>
+      <w:r>
+        <w:t xml:space="preserve"> </w:t>
+      </w:r>
+      <m:oMath>
+        <m:r>
+          <m:t>k</m:t>
+        </m:r>
+        <m:r>
+          <m:rPr>
+            <m:sty m:val="p"/>
+          </m:rPr>
+          <m:t>=</m:t>
+        </m:r>
+        <m:r>
+          <m:t>10</m:t>
+        </m:r>
+      </m:oMath>
+      <w:r>
+        <w:t xml:space="preserve"> </w:t>
+      </w:r>
+      <w:r>
+        <w:t xml:space="preserve">for bge-large. In a second exploratory comparison, bge-large with one passage gave higher EM than BM25 with ten passages (+0.022 [0.001, 0.042]; exact McNemar</w:t>
+      </w:r>
+      <w:r>
+        <w:t xml:space="preserve"> </w:t>
+      </w:r>
+      <m:oMath>
+        <m:r>
+          <m:t>p</m:t>
+        </m:r>
+      </m:oMath>
+      <w:r>
+        <w:t xml:space="preserve"> </w:t>
+      </w:r>
+      <w:r>
+        <w:t xml:space="preserve">= 0.044, uncorrected).</w:t>
       </w:r>
     </w:p>
     <w:p>
@@ -12639,7 +12736,7 @@
         </m:r>
       </m:oMath>
       <w:r>
-        <w:t xml:space="preserve">). Reranking the e5-base-v2 top 50 lowered Hit@5 by −0.067 (</w:t>
+        <w:t xml:space="preserve">). Reranking the e5-base-v2 top 50 changed Hit@5 by −0.067 (</w:t>
       </w:r>
       <m:oMath>
         <m:r>
@@ -13701,7 +13798,7 @@
         <w:t xml:space="preserve"> </w:t>
       </w:r>
       <w:r>
-        <w:t xml:space="preserve">in the appendix gives the same view for NQ nDCG@10.</w:t>
+        <w:t xml:space="preserve">in the appendix gives the same view for NQ nDCG@10. In an exploratory check that treats costs within 5% as equal, only one frontier changed, on both cost axes: with Qwen on NQ, bge-base left the frontier, because its cost is within 5% of e5-base-v2 and its EM is lower.</w:t>
       </w:r>
     </w:p>
     <w:p>
@@ -15815,7 +15912,35 @@
         </m:r>
       </m:oMath>
       <w:r>
-        <w:t xml:space="preserve">) we excluded the judge’s faithfulness labels from all conclusions.</w:t>
+        <w:t xml:space="preserve">) we excluded the judge’s faithfulness labels from all conclusions. For completeness, Table </w:t>
+      </w:r>
+      <w:hyperlink w:anchor="tab:judgerates">
+        <w:r>
+          <w:rPr>
+            <w:rStyle w:val="Hyperlink"/>
+          </w:rPr>
+          <w:t xml:space="preserve">11</w:t>
+        </w:r>
+      </w:hyperlink>
+      <w:r>
+        <w:t xml:space="preserve"> </w:t>
+      </w:r>
+      <w:r>
+        <w:t xml:space="preserve">in the appendix lists the share of answers the judge labelled as supported, and Appendix </w:t>
+      </w:r>
+      <w:hyperlink w:anchor="app:judge">
+        <w:r>
+          <w:rPr>
+            <w:rStyle w:val="Hyperlink"/>
+          </w:rPr>
+          <w:t xml:space="preserve">10</w:t>
+        </w:r>
+      </w:hyperlink>
+      <w:r>
+        <w:t xml:space="preserve"> </w:t>
+      </w:r>
+      <w:r>
+        <w:t xml:space="preserve">gives the judge prompt and the annotation instructions.</w:t>
       </w:r>
     </w:p>
     <w:bookmarkStart w:id="106" w:name="tab:judge"/>
@@ -17631,7 +17756,7 @@
         <w:t xml:space="preserve"> </w:t>
       </w:r>
       <w:r>
-        <w:t xml:space="preserve">still contained an answer-bearing passage that was not labelled gold, or the reader knew the answer. Hit@5 may therefore overstate the difference between encoders that matters for the reader. Three: EM given a hit fell slightly as encoders improved: the questions that a better encoder newly solves at the retrieval stage seem harder to answer. This last point is a hypothesis; we did not test which questions changed status.</w:t>
+        <w:t xml:space="preserve">likely still contained an answer-bearing passage that was not labelled gold, or the reader knew the answer. Hit@5 may therefore overstate the difference between encoders that matters for the reader. Three: EM given a hit fell slightly as encoders improved: the questions that a better encoder newly solves at the retrieval stage seem harder to answer. This last point is a hypothesis; we did not test which questions changed status.</w:t>
       </w:r>
     </w:p>
     <w:p>
@@ -17639,7 +17764,7 @@
         <w:pStyle w:val="BodyText"/>
       </w:pPr>
       <w:r>
-        <w:t xml:space="preserve">On multi-hop HotpotQA, Hit@5 saturated while Both@5 did not. Most of the transfer came from higher EM given a hit, and the EM ranking of retrievers followed Both@5 exactly. A reasonable reading is that, for bridge questions, the second supporting passage carries the answer, and Hit@5 does not count it. Under this reading the large HotpotQA ratios are partly an artefact of the denominator: the true retrieval gain is larger than Hit@5 shows. The comparison questions, where both entities are named in the question, were close to their gold bound for every dense encoder. Practitioners who build multi-hop systems should measure retrieval with a metric that requires all needed evidence.</w:t>
+        <w:t xml:space="preserve">On multi-hop HotpotQA, Hit@5 saturated while Both@5 did not. Between 48% and 70% of the transfer came from higher EM given a hit, and the EM ranking of retrievers followed Both@5 exactly. A reasonable reading is that, for bridge questions, the second supporting passage carries the answer, and Hit@5 does not count it. Under this reading the large HotpotQA ratios are partly an artefact of the denominator: the true retrieval gain is larger than Hit@5 shows. The comparison questions, where both entities are named in the question, were close to their gold bound for every dense encoder. Teams that build multi-hop systems may therefore prefer to measure retrieval with a metric that requires all needed evidence.</w:t>
       </w:r>
     </w:p>
     <w:p>
@@ -17647,7 +17772,7 @@
         <w:pStyle w:val="BodyText"/>
       </w:pPr>
       <w:r>
-        <w:t xml:space="preserve">The two datasets therefore support different conclusions about the same encoders. A team that judges encoders by single-hop retrieval benchmarks will overrate the answer value of the strongest ones. A team with multi-hop questions may underrate it if it uses Hit@k.</w:t>
+        <w:t xml:space="preserve">The two datasets therefore support different conclusions about the same encoders. A team that judges encoders by single-hop retrieval benchmarks may overrate the answer value of the strongest ones. A team with multi-hop questions may underrate it if it uses Hit@k.</w:t>
       </w:r>
     </w:p>
     <w:bookmarkEnd w:id="110"/>
@@ -17904,7 +18029,7 @@
         <w:pStyle w:val="FirstParagraph"/>
       </w:pPr>
       <w:r>
-        <w:t xml:space="preserve">Within our setup, the choice of encoder mattered less for answers than for retrieval, while its cost differed by more than an order of magnitude. For single-hop questions, a base-size encoder such as e5-base-v2 or bge-base gave answers that no larger encoder improved detectably, while encoding 2.9 times faster than bge-large. For multi-hop questions, bge-large gave a small but detectable gain. Qwen3-Embedding-0.6B was the most expensive encoder and gave lower answers than e5-base-v2 on HotpotQA; its instruction and length settings may not suit this task, and we did not tune them. Retrieving ten passages instead of five raised EM for most retrievers and narrowed their differences, which is a cheaper lever than a larger encoder when the reader’s context allows it. A cross-encoder helped the weak BM25 retrieval stage but not a strong dense one. Approximate search can replace exact search at no measurable cost in answers.</w:t>
+        <w:t xml:space="preserve">Within our setup, the choice of encoder mattered less for answers than for retrieval, while its cost differed by more than an order of magnitude. For single-hop questions, a base-size encoder such as e5-base-v2 or bge-base gave answers that no larger encoder improved detectably, while encoding 2.9 times faster than bge-large. For multi-hop questions, bge-large gave a small but detectable gain. Qwen3-Embedding-0.6B was the most expensive encoder and gave lower EM than e5-base-v2 on HotpotQA; its instruction and length settings may not suit this task, and we did not tune them. Retrieving ten passages instead of five raised EM for most retrievers and narrowed their differences, which is another lever when the reader’s context allows it, although it nearly doubles the prompt the reader must process. A cross-encoder helped the weak BM25 retrieval stage but not a strong dense one. Approximate search can replace exact search at no measurable cost in answers.</w:t>
       </w:r>
     </w:p>
     <w:bookmarkEnd w:id="112"/>
@@ -18175,7 +18300,7 @@
         <w:pStyle w:val="FirstParagraph"/>
       </w:pPr>
       <w:r>
-        <w:t xml:space="preserve">We measured how much of a retrieval gain reaches the answer when a RAG system swaps one open embedding model for another. On single-hop NQ, between 0.16 and 0.27 EM points followed each Hit@5 point gained over MiniLM-L6, for both readers (RQ1). On multi-hop HotpotQA the ratio was larger, mainly because better encoders more often retrieved the second supporting passage, which Hit@5 does not count. Among dense encoders, bge-large gave a small EM gain over e5-base-v2 on HotpotQA and none detectable on NQ, and Qwen3-Embedding-0.6B gave lower EM (RQ2). Top-ranked non-gold passages lowered EM, gold position did not change it detectably, a reranker helped only the weak BM25 retrieval stage, and ten passages narrowed the gaps between retrievers (RQ3). Encoding throughput differed 27-fold, while approximate search and the sub-corpus did not change the order of retrievers (RQ4).</w:t>
+        <w:t xml:space="preserve">We measured how much of a retrieval gain reaches the answer when a RAG system swaps one open embedding model for another. On single-hop NQ, between 0.16 and 0.27 EM points followed each Hit@5 point gained over MiniLM-L6, for both readers (RQ1). On multi-hop HotpotQA the ratio was larger; 48% to 70% of it came from higher EM given a hit, in line with better encoders retrieving the second supporting passage more often, which Hit@5 does not count. Among dense encoders, bge-large gave a small EM gain over e5-base-v2 on HotpotQA and none detectable on NQ, and Qwen3-Embedding-0.6B gave lower EM (RQ2). Top-ranked non-gold passages lowered EM, gold position did not change it detectably, a reranker helped only the weak BM25 retrieval stage, and ten passages narrowed the gaps between retrievers (RQ3). Encoding throughput differed 27-fold, while approximate search and the sub-corpus did not change the order of retrievers (RQ4).</w:t>
       </w:r>
     </w:p>
     <w:p>
@@ -18299,7 +18424,7 @@
           <w:rPr>
             <w:rStyle w:val="Hyperlink"/>
           </w:rPr>
-          <w:t xml:space="preserve">10</w:t>
+          <w:t xml:space="preserve">11</w:t>
         </w:r>
       </w:hyperlink>
       <w:r>
@@ -18521,16 +18646,153 @@
     </w:p>
     <w:bookmarkEnd w:id="131"/>
     <w:bookmarkEnd w:id="132"/>
-    <w:bookmarkStart w:id="134" w:name="app:repro"/>
+    <w:bookmarkStart w:id="133" w:name="app:judge"/>
     <w:p>
       <w:pPr>
         <w:pStyle w:val="Heading1"/>
       </w:pPr>
       <w:r>
+        <w:t xml:space="preserve">Judge prompt and annotation instructions</w:t>
+      </w:r>
+    </w:p>
+    <w:p>
+      <w:pPr>
+        <w:pStyle w:val="FirstParagraph"/>
+      </w:pPr>
+      <w:r>
+        <w:t xml:space="preserve">The LLM judge (Mistral-7B-Instruct-v0.3, greedy decoding, at most 8 new tokens) received one user message:</w:t>
+      </w:r>
+    </w:p>
+    <w:p>
+      <w:pPr>
+        <w:pStyle w:val="BlockText"/>
+      </w:pPr>
+      <w:r>
+        <w:rPr>
+          <w:iCs/>
+          <w:i/>
+        </w:rPr>
+        <w:t xml:space="preserve">You will be given PASSAGES, a QUESTION, and an ANSWER. Decide whether the ANSWER is fully supported by the PASSAGES. An answer is SUPPORTED only if the passages state it or directly imply it. Do not use outside knowledge. Do not judge whether the answer is true in the real world.</w:t>
+      </w:r>
+      <w:r>
+        <w:br/>
+      </w:r>
+      <w:r>
+        <w:rPr>
+          <w:iCs/>
+          <w:i/>
+        </w:rPr>
+        <w:t xml:space="preserve">PASSAGES:</w:t>
+      </w:r>
+      <w:r>
+        <w:t xml:space="preserve"> </w:t>
+      </w:r>
+      <w:r>
+        <w:t xml:space="preserve">[the same five passages the reader saw, formatted as in Appendix </w:t>
+      </w:r>
+      <w:hyperlink w:anchor="app:prompts">
+        <w:r>
+          <w:rPr>
+            <w:rStyle w:val="Hyperlink"/>
+          </w:rPr>
+          <w:t xml:space="preserve">9</w:t>
+        </w:r>
+      </w:hyperlink>
+      <w:r>
+        <w:t xml:space="preserve">]</w:t>
+      </w:r>
+      <w:r>
+        <w:br/>
+      </w:r>
+      <w:r>
+        <w:rPr>
+          <w:iCs/>
+          <w:i/>
+        </w:rPr>
+        <w:t xml:space="preserve">QUESTION:</w:t>
+      </w:r>
+      <w:r>
+        <w:t xml:space="preserve"> </w:t>
+      </w:r>
+      <w:r>
+        <w:t xml:space="preserve">{question}</w:t>
+      </w:r>
+      <w:r>
+        <w:t xml:space="preserve"> </w:t>
+      </w:r>
+      <w:r>
+        <w:rPr>
+          <w:iCs/>
+          <w:i/>
+        </w:rPr>
+        <w:t xml:space="preserve">ANSWER:</w:t>
+      </w:r>
+      <w:r>
+        <w:t xml:space="preserve"> </w:t>
+      </w:r>
+      <w:r>
+        <w:t xml:space="preserve">{answer}</w:t>
+      </w:r>
+      <w:r>
+        <w:br/>
+      </w:r>
+      <w:r>
+        <w:rPr>
+          <w:iCs/>
+          <w:i/>
+        </w:rPr>
+        <w:t xml:space="preserve">Reply with exactly one word: SUPPORTED or NOT_SUPPORTED.</w:t>
+      </w:r>
+    </w:p>
+    <w:p>
+      <w:pPr>
+        <w:pStyle w:val="FirstParagraph"/>
+      </w:pPr>
+      <w:r>
+        <w:t xml:space="preserve">The verdict was the label SUPPORTED or NOT_SUPPORTED found at the start of the output; there were no parse failures. The human annotator saw the same text, without the judge’s verdict, plus the instruction:</w:t>
+      </w:r>
+      <w:r>
+        <w:t xml:space="preserve"> </w:t>
+      </w:r>
+      <w:r>
+        <w:rPr>
+          <w:iCs/>
+          <w:i/>
+        </w:rPr>
+        <w:t xml:space="preserve">“</w:t>
+      </w:r>
+      <w:r>
+        <w:rPr>
+          <w:iCs/>
+          <w:i/>
+        </w:rPr>
+        <w:t xml:space="preserve">Label each item SUPPORTED or NOT_SUPPORTED. If unsure, choose NOT_SUPPORTED and add a note.</w:t>
+      </w:r>
+      <w:r>
+        <w:rPr>
+          <w:iCs/>
+          <w:i/>
+        </w:rPr>
+        <w:t xml:space="preserve">”</w:t>
+      </w:r>
+      <w:r>
+        <w:t xml:space="preserve"> </w:t>
+      </w:r>
+      <w:r>
+        <w:t xml:space="preserve">The 200 items were drawn by a seeded, stratified sampler that over-represents NOT_SUPPORTED verdicts; population-weighted statistics use the inverse inclusion probabilities.</w:t>
+      </w:r>
+    </w:p>
+    <w:bookmarkEnd w:id="133"/>
+    <w:bookmarkStart w:id="136" w:name="app:repro"/>
+    <w:p>
+      <w:pPr>
+        <w:pStyle w:val="Heading1"/>
+      </w:pPr>
+      <w:r>
         <w:t xml:space="preserve">Models, data and software</w:t>
       </w:r>
     </w:p>
-    <w:bookmarkStart w:id="133" w:name="tab:revisions"/>
+    <w:bookmarkStart w:id="134" w:name="tab:revisions"/>
     <w:p>
       <w:pPr>
         <w:pStyle w:val="TableCaption"/>
@@ -18997,7 +19259,7 @@
         </w:tc>
       </w:tr>
     </w:tbl>
-    <w:bookmarkEnd w:id="133"/>
+    <w:bookmarkEnd w:id="134"/>
     <w:p>
       <w:pPr>
         <w:pStyle w:val="BodyText"/>
@@ -19749,8 +20011,498 @@
         <w:t xml:space="preserve">. Qwen3-Embedding uses a task instruction per dataset.</w:t>
       </w:r>
     </w:p>
-    <w:bookmarkEnd w:id="134"/>
-    <w:bookmarkStart w:id="135" w:name="app:prereg"/>
+    <w:bookmarkStart w:id="135" w:name="tab:data"/>
+    <w:p>
+      <w:pPr>
+        <w:pStyle w:val="TableCaption"/>
+      </w:pPr>
+      <w:r>
+        <w:t xml:space="preserve">Data and sub-corpora.</w:t>
+      </w:r>
+    </w:p>
+    <w:tbl>
+      <w:tblPr>
+        <w:tblStyle w:val="Table"/>
+        <w:tblW w:type="auto" w:w="0"/>
+        <w:tblLook w:firstRow="1" w:lastRow="0" w:firstColumn="0" w:lastColumn="0" w:noHBand="0" w:noVBand="0" w:val="0020"/>
+        <w:jc w:val="start"/>
+        <w:tblCaption w:val="Data and sub-corpora."/>
+      </w:tblPr>
+      <w:tblGrid>
+        <w:gridCol w:w="2640"/>
+        <w:gridCol w:w="2640"/>
+        <w:gridCol w:w="2640"/>
+      </w:tblGrid>
+      <w:tr>
+        <w:trPr>
+          <w:tblHeader w:val="true"/>
+        </w:trPr>
+        <w:tc>
+          <w:tcPr/>
+          <w:p>
+            <w:pPr>
+              <w:pStyle w:val="Compact"/>
+              <w:jc w:val="left"/>
+            </w:pPr>
+            <w:r>
+              <w:t xml:space="preserve">Item</w:t>
+            </w:r>
+          </w:p>
+        </w:tc>
+        <w:tc>
+          <w:tcPr/>
+          <w:p>
+            <w:pPr>
+              <w:pStyle w:val="Compact"/>
+              <w:jc w:val="left"/>
+            </w:pPr>
+            <w:r>
+              <w:t xml:space="preserve">NQ</w:t>
+            </w:r>
+          </w:p>
+        </w:tc>
+        <w:tc>
+          <w:tcPr/>
+          <w:p>
+            <w:pPr>
+              <w:pStyle w:val="Compact"/>
+              <w:jc w:val="left"/>
+            </w:pPr>
+            <w:r>
+              <w:t xml:space="preserve">HotpotQA</w:t>
+            </w:r>
+          </w:p>
+        </w:tc>
+      </w:tr>
+      <w:tr>
+        <w:tc>
+          <w:tcPr/>
+          <w:p>
+            <w:pPr>
+              <w:pStyle w:val="Compact"/>
+              <w:jc w:val="left"/>
+            </w:pPr>
+            <w:r>
+              <w:t xml:space="preserve">Full corpus (passages)</w:t>
+            </w:r>
+          </w:p>
+        </w:tc>
+        <w:tc>
+          <w:tcPr/>
+          <w:p>
+            <w:pPr>
+              <w:pStyle w:val="Compact"/>
+              <w:jc w:val="left"/>
+            </w:pPr>
+            <w:r>
+              <w:t xml:space="preserve">2,681,468</w:t>
+            </w:r>
+          </w:p>
+        </w:tc>
+        <w:tc>
+          <w:tcPr/>
+          <w:p>
+            <w:pPr>
+              <w:pStyle w:val="Compact"/>
+              <w:jc w:val="left"/>
+            </w:pPr>
+            <w:r>
+              <w:t xml:space="preserve">5,233,329</w:t>
+            </w:r>
+          </w:p>
+        </w:tc>
+      </w:tr>
+      <w:tr>
+        <w:tc>
+          <w:tcPr/>
+          <w:p>
+            <w:pPr>
+              <w:pStyle w:val="Compact"/>
+              <w:jc w:val="left"/>
+            </w:pPr>
+            <w:r>
+              <w:t xml:space="preserve">Judged test queries</w:t>
+            </w:r>
+          </w:p>
+        </w:tc>
+        <w:tc>
+          <w:tcPr/>
+          <w:p>
+            <w:pPr>
+              <w:pStyle w:val="Compact"/>
+              <w:jc w:val="left"/>
+            </w:pPr>
+            <w:r>
+              <w:t xml:space="preserve">3,452</w:t>
+            </w:r>
+          </w:p>
+        </w:tc>
+        <w:tc>
+          <w:tcPr/>
+          <w:p>
+            <w:pPr>
+              <w:pStyle w:val="Compact"/>
+              <w:jc w:val="left"/>
+            </w:pPr>
+            <w:r>
+              <w:t xml:space="preserve">7,405</w:t>
+            </w:r>
+          </w:p>
+        </w:tc>
+      </w:tr>
+      <w:tr>
+        <w:tc>
+          <w:tcPr/>
+          <w:p>
+            <w:pPr>
+              <w:pStyle w:val="Compact"/>
+              <w:jc w:val="left"/>
+            </w:pPr>
+            <w:r>
+              <w:t xml:space="preserve">Queries joined to reference answers</w:t>
+            </w:r>
+          </w:p>
+        </w:tc>
+        <w:tc>
+          <w:tcPr/>
+          <w:p>
+            <w:pPr>
+              <w:pStyle w:val="Compact"/>
+              <w:jc w:val="left"/>
+            </w:pPr>
+            <w:r>
+              <w:t xml:space="preserve">2,255</w:t>
+            </w:r>
+          </w:p>
+        </w:tc>
+        <w:tc>
+          <w:tcPr/>
+          <w:p>
+            <w:pPr>
+              <w:pStyle w:val="Compact"/>
+              <w:jc w:val="left"/>
+            </w:pPr>
+            <w:r>
+              <w:t xml:space="preserve">7,405</w:t>
+            </w:r>
+          </w:p>
+        </w:tc>
+      </w:tr>
+      <w:tr>
+        <w:tc>
+          <w:tcPr/>
+          <w:p>
+            <w:pPr>
+              <w:pStyle w:val="Compact"/>
+              <w:jc w:val="left"/>
+            </w:pPr>
+            <w:r>
+              <w:t xml:space="preserve">Generation queries</w:t>
+            </w:r>
+          </w:p>
+        </w:tc>
+        <w:tc>
+          <w:tcPr/>
+          <w:p>
+            <w:pPr>
+              <w:pStyle w:val="Compact"/>
+              <w:jc w:val="left"/>
+            </w:pPr>
+            <w:r>
+              <w:t xml:space="preserve">2,255</w:t>
+            </w:r>
+          </w:p>
+        </w:tc>
+        <w:tc>
+          <w:tcPr/>
+          <w:p>
+            <w:pPr>
+              <w:pStyle w:val="Compact"/>
+              <w:jc w:val="left"/>
+            </w:pPr>
+            <w:r>
+              <w:t xml:space="preserve">2,000 (1,616 bridge, 384 comparison)</w:t>
+            </w:r>
+          </w:p>
+        </w:tc>
+      </w:tr>
+      <w:tr>
+        <w:tc>
+          <w:tcPr/>
+          <w:p>
+            <w:pPr>
+              <w:pStyle w:val="Compact"/>
+              <w:jc w:val="left"/>
+            </w:pPr>
+            <w:r>
+              <w:t xml:space="preserve">Unique gold passages per judged query</w:t>
+            </w:r>
+          </w:p>
+        </w:tc>
+        <w:tc>
+          <w:tcPr/>
+          <w:p>
+            <w:pPr>
+              <w:pStyle w:val="Compact"/>
+              <w:jc w:val="left"/>
+            </w:pPr>
+            <w:r>
+              <w:t xml:space="preserve">1.22</w:t>
+            </w:r>
+          </w:p>
+        </w:tc>
+        <w:tc>
+          <w:tcPr/>
+          <w:p>
+            <w:pPr>
+              <w:pStyle w:val="Compact"/>
+              <w:jc w:val="left"/>
+            </w:pPr>
+            <w:r>
+              <w:t xml:space="preserve">1.86</w:t>
+            </w:r>
+          </w:p>
+        </w:tc>
+      </w:tr>
+      <w:tr>
+        <w:tc>
+          <w:tcPr/>
+          <w:p>
+            <w:pPr>
+              <w:pStyle w:val="Compact"/>
+              <w:jc w:val="left"/>
+            </w:pPr>
+            <w:r>
+              <w:t xml:space="preserve">Sub-corpus size</w:t>
+            </w:r>
+          </w:p>
+        </w:tc>
+        <w:tc>
+          <w:tcPr/>
+          <w:p>
+            <w:pPr>
+              <w:pStyle w:val="Compact"/>
+              <w:jc w:val="left"/>
+            </w:pPr>
+            <w:r>
+              <w:t xml:space="preserve">300,000</w:t>
+            </w:r>
+          </w:p>
+        </w:tc>
+        <w:tc>
+          <w:tcPr/>
+          <w:p>
+            <w:pPr>
+              <w:pStyle w:val="Compact"/>
+              <w:jc w:val="left"/>
+            </w:pPr>
+            <w:r>
+              <w:t xml:space="preserve">300,000</w:t>
+            </w:r>
+          </w:p>
+        </w:tc>
+      </w:tr>
+      <w:tr>
+        <w:tc>
+          <w:tcPr/>
+          <w:p>
+            <w:pPr>
+              <w:pStyle w:val="Compact"/>
+              <w:jc w:val="left"/>
+            </w:pPr>
+            <w:r>
+              <w:t xml:space="preserve">gold passages</w:t>
+            </w:r>
+          </w:p>
+        </w:tc>
+        <w:tc>
+          <w:tcPr/>
+          <w:p>
+            <w:pPr>
+              <w:pStyle w:val="Compact"/>
+              <w:jc w:val="left"/>
+            </w:pPr>
+            <w:r>
+              <w:t xml:space="preserve">4,201</w:t>
+            </w:r>
+          </w:p>
+        </w:tc>
+        <w:tc>
+          <w:tcPr/>
+          <w:p>
+            <w:pPr>
+              <w:pStyle w:val="Compact"/>
+              <w:jc w:val="left"/>
+            </w:pPr>
+            <w:r>
+              <w:t xml:space="preserve">13,783</w:t>
+            </w:r>
+          </w:p>
+        </w:tc>
+      </w:tr>
+      <w:tr>
+        <w:tc>
+          <w:tcPr/>
+          <w:p>
+            <w:pPr>
+              <w:pStyle w:val="Compact"/>
+              <w:jc w:val="left"/>
+            </w:pPr>
+            <w:r>
+              <w:t xml:space="preserve">BM25 non-gold passages (depth</w:t>
+            </w:r>
+            <w:r>
+              <w:t xml:space="preserve"> </w:t>
+            </w:r>
+            <m:oMath>
+              <m:r>
+                <m:t>d</m:t>
+              </m:r>
+            </m:oMath>
+            <w:r>
+              <w:t xml:space="preserve">)</w:t>
+            </w:r>
+          </w:p>
+        </w:tc>
+        <w:tc>
+          <w:tcPr/>
+          <w:p>
+            <w:pPr>
+              <w:pStyle w:val="Compact"/>
+              <w:jc w:val="left"/>
+            </w:pPr>
+            <w:r>
+              <w:t xml:space="preserve">127,791 (</w:t>
+            </w:r>
+            <m:oMath>
+              <m:r>
+                <m:t>d</m:t>
+              </m:r>
+            </m:oMath>
+            <w:r>
+              <w:t xml:space="preserve"> </w:t>
+            </w:r>
+            <w:r>
+              <w:t xml:space="preserve">= 42)</w:t>
+            </w:r>
+          </w:p>
+        </w:tc>
+        <w:tc>
+          <w:tcPr/>
+          <w:p>
+            <w:pPr>
+              <w:pStyle w:val="Compact"/>
+              <w:jc w:val="left"/>
+            </w:pPr>
+            <w:r>
+              <w:t xml:space="preserve">118,726 (</w:t>
+            </w:r>
+            <m:oMath>
+              <m:r>
+                <m:t>d</m:t>
+              </m:r>
+            </m:oMath>
+            <w:r>
+              <w:t xml:space="preserve"> </w:t>
+            </w:r>
+            <w:r>
+              <w:t xml:space="preserve">= 19)</w:t>
+            </w:r>
+          </w:p>
+        </w:tc>
+      </w:tr>
+      <w:tr>
+        <w:tc>
+          <w:tcPr/>
+          <w:p>
+            <w:pPr>
+              <w:pStyle w:val="Compact"/>
+              <w:jc w:val="left"/>
+            </w:pPr>
+            <w:r>
+              <w:t xml:space="preserve">random passages</w:t>
+            </w:r>
+          </w:p>
+        </w:tc>
+        <w:tc>
+          <w:tcPr/>
+          <w:p>
+            <w:pPr>
+              <w:pStyle w:val="Compact"/>
+              <w:jc w:val="left"/>
+            </w:pPr>
+            <w:r>
+              <w:t xml:space="preserve">168,008</w:t>
+            </w:r>
+          </w:p>
+        </w:tc>
+        <w:tc>
+          <w:tcPr/>
+          <w:p>
+            <w:pPr>
+              <w:pStyle w:val="Compact"/>
+              <w:jc w:val="left"/>
+            </w:pPr>
+            <w:r>
+              <w:t xml:space="preserve">167,491</w:t>
+            </w:r>
+          </w:p>
+        </w:tc>
+      </w:tr>
+      <w:tr>
+        <w:tc>
+          <w:tcPr/>
+          <w:p>
+            <w:pPr>
+              <w:pStyle w:val="Compact"/>
+              <w:jc w:val="left"/>
+            </w:pPr>
+            <w:r>
+              <w:t xml:space="preserve">Reference answers</w:t>
+            </w:r>
+          </w:p>
+        </w:tc>
+        <w:tc>
+          <w:tcPr/>
+          <w:p>
+            <w:pPr>
+              <w:pStyle w:val="Compact"/>
+              <w:jc w:val="left"/>
+            </w:pPr>
+            <w:r>
+              <w:t xml:space="preserve">NQ-open (validation)</w:t>
+            </w:r>
+          </w:p>
+        </w:tc>
+        <w:tc>
+          <w:tcPr/>
+          <w:p>
+            <w:pPr>
+              <w:pStyle w:val="Compact"/>
+              <w:jc w:val="left"/>
+            </w:pPr>
+            <w:r>
+              <w:t xml:space="preserve">HotpotQA fullwiki (validation)</w:t>
+            </w:r>
+          </w:p>
+        </w:tc>
+      </w:tr>
+    </w:tbl>
+    <w:bookmarkEnd w:id="135"/>
+    <w:p>
+      <w:pPr>
+        <w:pStyle w:val="BodyText"/>
+      </w:pPr>
+      <w:r>
+        <w:rPr>
+          <w:iCs/>
+          <w:i/>
+        </w:rPr>
+        <w:t xml:space="preserve">Corpus sizes as distributed by BEIR. Joins: NQ by normalised question text, HotpotQA by question id.</w:t>
+      </w:r>
+    </w:p>
+    <w:bookmarkEnd w:id="136"/>
+    <w:bookmarkStart w:id="137" w:name="app:prereg"/>
     <w:p>
       <w:pPr>
         <w:pStyle w:val="Heading1"/>
@@ -19848,7 +20600,7 @@
         <w:t xml:space="preserve"> </w:t>
       </w:r>
       <w:r>
-        <w:t xml:space="preserve">Execution records of Phase 1, the failed first reading session, the cost-estimate error and the cut dimension ablation.</w:t>
+        <w:t xml:space="preserve">Execution records of Phase 1, the failed initial reading session, the cost-estimate error and the cut dimension ablation.</w:t>
       </w:r>
     </w:p>
     <w:p>
@@ -19922,8 +20674,8 @@
         <w:t xml:space="preserve">Pilot numbers were used only for planning and are not reported as results.</w:t>
       </w:r>
     </w:p>
-    <w:bookmarkEnd w:id="135"/>
-    <w:bookmarkStart w:id="237" w:name="app:tables"/>
+    <w:bookmarkEnd w:id="137"/>
+    <w:bookmarkStart w:id="240" w:name="app:tables"/>
     <w:p>
       <w:pPr>
         <w:pStyle w:val="Heading1"/>
@@ -20008,7 +20760,7 @@
           <w:rPr>
             <w:rStyle w:val="Hyperlink"/>
           </w:rPr>
-          <w:t xml:space="preserve">9</w:t>
+          <w:t xml:space="preserve">10</w:t>
         </w:r>
       </w:hyperlink>
       <w:r>
@@ -20040,7 +20792,7 @@
         </m:r>
       </m:oMath>
       <w:r>
-        <w:t xml:space="preserve">, and Table </w:t>
+        <w:t xml:space="preserve">, Table </w:t>
       </w:r>
       <w:hyperlink w:anchor="tab:pairwise">
         <w:r>
@@ -20054,7 +20806,21 @@
         <w:t xml:space="preserve"> </w:t>
       </w:r>
       <w:r>
-        <w:t xml:space="preserve">all pairwise EM tests.</w:t>
+        <w:t xml:space="preserve">all pairwise EM tests, and Table </w:t>
+      </w:r>
+      <w:hyperlink w:anchor="tab:judgerates">
+        <w:r>
+          <w:rPr>
+            <w:rStyle w:val="Hyperlink"/>
+          </w:rPr>
+          <w:t xml:space="preserve">11</w:t>
+        </w:r>
+      </w:hyperlink>
+      <w:r>
+        <w:t xml:space="preserve"> </w:t>
+      </w:r>
+      <w:r>
+        <w:t xml:space="preserve">the excluded judge labels.</w:t>
       </w:r>
     </w:p>
     <w:tbl>
@@ -22549,7 +23315,7 @@
         <w:t xml:space="preserve">Closed-book EM for comparison: NQ 0.149 (Qwen), 0.197 (Llama); HotpotQA 0.158 (Qwen), 0.148 (Llama).</w:t>
       </w:r>
     </w:p>
-    <w:bookmarkStart w:id="136" w:name="tab:idk"/>
+    <w:bookmarkStart w:id="138" w:name="tab:idk"/>
     <w:p>
       <w:pPr>
         <w:pStyle w:val="TableCaption"/>
@@ -23139,7 +23905,7 @@
         </w:tc>
       </w:tr>
     </w:tbl>
-    <w:bookmarkEnd w:id="136"/>
+    <w:bookmarkEnd w:id="138"/>
     <w:p>
       <w:pPr>
         <w:pStyle w:val="BodyText"/>
@@ -26881,6 +27647,427 @@
         <w:t xml:space="preserve">).</w:t>
       </w:r>
     </w:p>
+    <w:bookmarkStart w:id="139" w:name="tab:judgerates"/>
+    <w:p>
+      <w:pPr>
+        <w:pStyle w:val="TableCaption"/>
+      </w:pPr>
+      <w:r>
+        <w:t xml:space="preserve">Phase 1 LLM-judge labels (Mistral-7B-Instruct-v0.3, zero-shot prompt of Appendix </w:t>
+      </w:r>
+      <w:hyperlink w:anchor="app:judge">
+        <w:r>
+          <w:rPr>
+            <w:rStyle w:val="Hyperlink"/>
+          </w:rPr>
+          <w:t xml:space="preserve">10</w:t>
+        </w:r>
+      </w:hyperlink>
+      <w:r>
+        <w:t xml:space="preserve">), Qwen reader, NQ.</w:t>
+      </w:r>
+      <w:r>
+        <w:t xml:space="preserve"> </w:t>
+      </w:r>
+      <w:r>
+        <w:rPr>
+          <w:bCs/>
+          <w:b/>
+        </w:rPr>
+        <w:t xml:space="preserve">Excluded from all conclusions</w:t>
+      </w:r>
+      <w:r>
+        <w:t xml:space="preserve"> </w:t>
+      </w:r>
+      <w:r>
+        <w:t xml:space="preserve">because agreement with human labels was slight (</w:t>
+      </w:r>
+      <m:oMath>
+        <m:r>
+          <m:t>κ</m:t>
+        </m:r>
+      </m:oMath>
+      <w:r>
+        <w:t xml:space="preserve"> </w:t>
+      </w:r>
+      <w:r>
+        <w:t xml:space="preserve">= 0.127).</w:t>
+      </w:r>
+    </w:p>
+    <w:tbl>
+      <w:tblPr>
+        <w:tblStyle w:val="Table"/>
+        <w:tblW w:type="auto" w:w="0"/>
+        <w:tblLook w:firstRow="1" w:lastRow="0" w:firstColumn="0" w:lastColumn="0" w:noHBand="0" w:noVBand="0" w:val="0020"/>
+        <w:jc w:val="start"/>
+        <w:tblCaption w:val="Phase 1 LLM-judge labels (Mistral-7B-Instruct-v0.3, zero-shot prompt of Appendix 10), Qwen reader, NQ. Excluded from all conclusions because agreement with human labels was slight (\kappa = 0.127)."/>
+      </w:tblPr>
+      <w:tblGrid>
+        <w:gridCol w:w="2640"/>
+        <w:gridCol w:w="2640"/>
+        <w:gridCol w:w="2640"/>
+      </w:tblGrid>
+      <w:tr>
+        <w:trPr>
+          <w:tblHeader w:val="true"/>
+        </w:trPr>
+        <w:tc>
+          <w:tcPr/>
+          <w:p>
+            <w:pPr>
+              <w:pStyle w:val="Compact"/>
+              <w:jc w:val="left"/>
+            </w:pPr>
+            <w:r>
+              <w:t xml:space="preserve">Context</w:t>
+            </w:r>
+          </w:p>
+        </w:tc>
+        <w:tc>
+          <w:tcPr/>
+          <w:p>
+            <w:pPr>
+              <w:pStyle w:val="Compact"/>
+              <w:jc w:val="right"/>
+            </w:pPr>
+            <m:oMath>
+              <m:r>
+                <m:t>n</m:t>
+              </m:r>
+            </m:oMath>
+          </w:p>
+        </w:tc>
+        <w:tc>
+          <w:tcPr/>
+          <w:p>
+            <w:pPr>
+              <w:pStyle w:val="Compact"/>
+              <w:jc w:val="center"/>
+            </w:pPr>
+            <w:r>
+              <w:t xml:space="preserve">Share judged SUPPORTED [95% CI]</w:t>
+            </w:r>
+          </w:p>
+        </w:tc>
+      </w:tr>
+      <w:tr>
+        <w:tc>
+          <w:tcPr/>
+          <w:p>
+            <w:pPr>
+              <w:pStyle w:val="Compact"/>
+              <w:jc w:val="left"/>
+            </w:pPr>
+            <w:r>
+              <w:t xml:space="preserve">BM25</w:t>
+            </w:r>
+          </w:p>
+        </w:tc>
+        <w:tc>
+          <w:tcPr/>
+          <w:p>
+            <w:pPr>
+              <w:pStyle w:val="Compact"/>
+              <w:jc w:val="right"/>
+            </w:pPr>
+            <w:r>
+              <w:t xml:space="preserve">500</w:t>
+            </w:r>
+          </w:p>
+        </w:tc>
+        <w:tc>
+          <w:tcPr/>
+          <w:p>
+            <w:pPr>
+              <w:pStyle w:val="Compact"/>
+              <w:jc w:val="center"/>
+            </w:pPr>
+            <w:r>
+              <w:t xml:space="preserve">0.790 [0.754, 0.826]</w:t>
+            </w:r>
+          </w:p>
+        </w:tc>
+      </w:tr>
+      <w:tr>
+        <w:tc>
+          <w:tcPr/>
+          <w:p>
+            <w:pPr>
+              <w:pStyle w:val="Compact"/>
+              <w:jc w:val="left"/>
+            </w:pPr>
+            <w:r>
+              <w:t xml:space="preserve">MiniLM-L6</w:t>
+            </w:r>
+          </w:p>
+        </w:tc>
+        <w:tc>
+          <w:tcPr/>
+          <w:p>
+            <w:pPr>
+              <w:pStyle w:val="Compact"/>
+              <w:jc w:val="right"/>
+            </w:pPr>
+            <w:r>
+              <w:t xml:space="preserve">500</w:t>
+            </w:r>
+          </w:p>
+        </w:tc>
+        <w:tc>
+          <w:tcPr/>
+          <w:p>
+            <w:pPr>
+              <w:pStyle w:val="Compact"/>
+              <w:jc w:val="center"/>
+            </w:pPr>
+            <w:r>
+              <w:t xml:space="preserve">0.886 [0.858, 0.914]</w:t>
+            </w:r>
+          </w:p>
+        </w:tc>
+      </w:tr>
+      <w:tr>
+        <w:tc>
+          <w:tcPr/>
+          <w:p>
+            <w:pPr>
+              <w:pStyle w:val="Compact"/>
+              <w:jc w:val="left"/>
+            </w:pPr>
+            <w:r>
+              <w:t xml:space="preserve">bge-small</w:t>
+            </w:r>
+          </w:p>
+        </w:tc>
+        <w:tc>
+          <w:tcPr/>
+          <w:p>
+            <w:pPr>
+              <w:pStyle w:val="Compact"/>
+              <w:jc w:val="right"/>
+            </w:pPr>
+            <w:r>
+              <w:t xml:space="preserve">500</w:t>
+            </w:r>
+          </w:p>
+        </w:tc>
+        <w:tc>
+          <w:tcPr/>
+          <w:p>
+            <w:pPr>
+              <w:pStyle w:val="Compact"/>
+              <w:jc w:val="center"/>
+            </w:pPr>
+            <w:r>
+              <w:t xml:space="preserve">0.898 [0.870, 0.924]</w:t>
+            </w:r>
+          </w:p>
+        </w:tc>
+      </w:tr>
+      <w:tr>
+        <w:tc>
+          <w:tcPr/>
+          <w:p>
+            <w:pPr>
+              <w:pStyle w:val="Compact"/>
+              <w:jc w:val="left"/>
+            </w:pPr>
+            <w:r>
+              <w:t xml:space="preserve">bge-base</w:t>
+            </w:r>
+          </w:p>
+        </w:tc>
+        <w:tc>
+          <w:tcPr/>
+          <w:p>
+            <w:pPr>
+              <w:pStyle w:val="Compact"/>
+              <w:jc w:val="right"/>
+            </w:pPr>
+            <w:r>
+              <w:t xml:space="preserve">500</w:t>
+            </w:r>
+          </w:p>
+        </w:tc>
+        <w:tc>
+          <w:tcPr/>
+          <w:p>
+            <w:pPr>
+              <w:pStyle w:val="Compact"/>
+              <w:jc w:val="center"/>
+            </w:pPr>
+            <w:r>
+              <w:t xml:space="preserve">0.902 [0.876, 0.928]</w:t>
+            </w:r>
+          </w:p>
+        </w:tc>
+      </w:tr>
+      <w:tr>
+        <w:tc>
+          <w:tcPr/>
+          <w:p>
+            <w:pPr>
+              <w:pStyle w:val="Compact"/>
+              <w:jc w:val="left"/>
+            </w:pPr>
+            <w:r>
+              <w:t xml:space="preserve">bge-large</w:t>
+            </w:r>
+          </w:p>
+        </w:tc>
+        <w:tc>
+          <w:tcPr/>
+          <w:p>
+            <w:pPr>
+              <w:pStyle w:val="Compact"/>
+              <w:jc w:val="right"/>
+            </w:pPr>
+            <w:r>
+              <w:t xml:space="preserve">500</w:t>
+            </w:r>
+          </w:p>
+        </w:tc>
+        <w:tc>
+          <w:tcPr/>
+          <w:p>
+            <w:pPr>
+              <w:pStyle w:val="Compact"/>
+              <w:jc w:val="center"/>
+            </w:pPr>
+            <w:r>
+              <w:t xml:space="preserve">0.912 [0.886, 0.936]</w:t>
+            </w:r>
+          </w:p>
+        </w:tc>
+      </w:tr>
+      <w:tr>
+        <w:tc>
+          <w:tcPr/>
+          <w:p>
+            <w:pPr>
+              <w:pStyle w:val="Compact"/>
+              <w:jc w:val="left"/>
+            </w:pPr>
+            <w:r>
+              <w:t xml:space="preserve">e5-base-v2</w:t>
+            </w:r>
+          </w:p>
+        </w:tc>
+        <w:tc>
+          <w:tcPr/>
+          <w:p>
+            <w:pPr>
+              <w:pStyle w:val="Compact"/>
+              <w:jc w:val="right"/>
+            </w:pPr>
+            <w:r>
+              <w:t xml:space="preserve">500</w:t>
+            </w:r>
+          </w:p>
+        </w:tc>
+        <w:tc>
+          <w:tcPr/>
+          <w:p>
+            <w:pPr>
+              <w:pStyle w:val="Compact"/>
+              <w:jc w:val="center"/>
+            </w:pPr>
+            <w:r>
+              <w:t xml:space="preserve">0.916 [0.890, 0.940]</w:t>
+            </w:r>
+          </w:p>
+        </w:tc>
+      </w:tr>
+      <w:tr>
+        <w:tc>
+          <w:tcPr/>
+          <w:p>
+            <w:pPr>
+              <w:pStyle w:val="Compact"/>
+              <w:jc w:val="left"/>
+            </w:pPr>
+            <w:r>
+              <w:t xml:space="preserve">Qwen3-Emb-0.6B</w:t>
+            </w:r>
+          </w:p>
+        </w:tc>
+        <w:tc>
+          <w:tcPr/>
+          <w:p>
+            <w:pPr>
+              <w:pStyle w:val="Compact"/>
+              <w:jc w:val="right"/>
+            </w:pPr>
+            <w:r>
+              <w:t xml:space="preserve">500</w:t>
+            </w:r>
+          </w:p>
+        </w:tc>
+        <w:tc>
+          <w:tcPr/>
+          <w:p>
+            <w:pPr>
+              <w:pStyle w:val="Compact"/>
+              <w:jc w:val="center"/>
+            </w:pPr>
+            <w:r>
+              <w:t xml:space="preserve">0.896 [0.870, 0.922]</w:t>
+            </w:r>
+          </w:p>
+        </w:tc>
+      </w:tr>
+      <w:tr>
+        <w:tc>
+          <w:tcPr/>
+          <w:p>
+            <w:pPr>
+              <w:pStyle w:val="Compact"/>
+              <w:jc w:val="left"/>
+            </w:pPr>
+            <w:r>
+              <w:t xml:space="preserve">Gold passages</w:t>
+            </w:r>
+          </w:p>
+        </w:tc>
+        <w:tc>
+          <w:tcPr/>
+          <w:p>
+            <w:pPr>
+              <w:pStyle w:val="Compact"/>
+              <w:jc w:val="right"/>
+            </w:pPr>
+            <w:r>
+              <w:t xml:space="preserve">499</w:t>
+            </w:r>
+          </w:p>
+        </w:tc>
+        <w:tc>
+          <w:tcPr/>
+          <w:p>
+            <w:pPr>
+              <w:pStyle w:val="Compact"/>
+              <w:jc w:val="center"/>
+            </w:pPr>
+            <w:r>
+              <w:t xml:space="preserve">0.966 [0.950, 0.980]</w:t>
+            </w:r>
+          </w:p>
+        </w:tc>
+      </w:tr>
+    </w:tbl>
+    <w:bookmarkEnd w:id="139"/>
+    <w:p>
+      <w:pPr>
+        <w:pStyle w:val="BodyText"/>
+      </w:pPr>
+      <w:r>
+        <w:rPr>
+          <w:iCs/>
+          <w:i/>
+        </w:rPr>
+        <w:t xml:space="preserve">3,999 judgements; one gold-passage output reached the token limit, so the gold row has 499 items.</w:t>
+      </w:r>
+    </w:p>
     <w:p>
       <w:pPr>
         <w:pStyle w:val="CaptionedFigure"/>
@@ -26890,18 +28077,18 @@
           <wp:inline>
             <wp:extent cx="5334000" cy="1649855"/>
             <wp:effectExtent b="0" l="0" r="0" t="0"/>
-            <wp:docPr descr="" title="" id="138" name="Picture"/>
+            <wp:docPr descr="" title="" id="141" name="Picture"/>
             <a:graphic>
               <a:graphicData uri="http://schemas.openxmlformats.org/drawingml/2006/picture">
                 <pic:pic>
                   <pic:nvPicPr>
-                    <pic:cNvPr descr="/home/claude/rag-embed-transfer/paper_figures/out/fig12_latency.png" id="139" name="Picture"/>
+                    <pic:cNvPr descr="/home/claude/rag-embed-transfer/paper_figures/out/fig12_latency.png" id="142" name="Picture"/>
                     <pic:cNvPicPr>
                       <a:picLocks noChangeArrowheads="1" noChangeAspect="1"/>
                     </pic:cNvPicPr>
                   </pic:nvPicPr>
                   <pic:blipFill>
-                    <a:blip r:embed="rId137"/>
+                    <a:blip r:embed="rId140"/>
                     <a:stretch>
                       <a:fillRect/>
                     </a:stretch>
@@ -26936,8 +28123,8 @@
         <w:t xml:space="preserve">NQ nDCG@10 against per-query latency (Phase 1 batch-1 medians, log scale): (a) query encoding on the T4 and exact search on the CPU; (b) both on the CPU.</w:t>
       </w:r>
     </w:p>
-    <w:bookmarkStart w:id="236" w:name="refs"/>
-    <w:bookmarkStart w:id="141" w:name="ref-amiraz2025distracting"/>
+    <w:bookmarkStart w:id="239" w:name="refs"/>
+    <w:bookmarkStart w:id="144" w:name="ref-amiraz2025distracting"/>
     <w:p>
       <w:pPr>
         <w:pStyle w:val="Bibliography"/>
@@ -26949,13 +28136,10 @@
         <w:t xml:space="preserve"> </w:t>
       </w:r>
       <w:r>
-        <w:t xml:space="preserve">“The Distracting Effect: Understanding Irrelevant Passages in</w:t>
-      </w:r>
-      <w:r>
-        <w:t xml:space="preserve"> </w:t>
-      </w:r>
-      <w:r>
-        <w:t xml:space="preserve">RAG</w:t>
+        <w:t xml:space="preserve">“</w:t>
+      </w:r>
+      <w:r>
+        <w:t xml:space="preserve">The Distracting Effect: Understanding Irrelevant Passages in RAG</w:t>
       </w:r>
       <w:r>
         <w:t xml:space="preserve">.”</w:t>
@@ -26982,7 +28166,7 @@
       <w:r>
         <w:t xml:space="preserve"> </w:t>
       </w:r>
-      <w:hyperlink r:id="rId140">
+      <w:hyperlink r:id="rId143">
         <w:r>
           <w:rPr>
             <w:rStyle w:val="Hyperlink"/>
@@ -26994,8 +28178,8 @@
         <w:t xml:space="preserve">.</w:t>
       </w:r>
     </w:p>
-    <w:bookmarkEnd w:id="141"/>
-    <w:bookmarkStart w:id="142" w:name="ref-elassadi2026embedder"/>
+    <w:bookmarkEnd w:id="144"/>
+    <w:bookmarkStart w:id="145" w:name="ref-elassadi2026embedder"/>
     <w:p>
       <w:pPr>
         <w:pStyle w:val="Bibliography"/>
@@ -27007,26 +28191,20 @@
         <w:t xml:space="preserve"> </w:t>
       </w:r>
       <w:r>
-        <w:t xml:space="preserve">“The Embedder’s Dilemma:</w:t>
-      </w:r>
-      <w:r>
-        <w:t xml:space="preserve"> </w:t>
-      </w:r>
-      <w:r>
-        <w:t xml:space="preserve">LLMs</w:t>
-      </w:r>
-      <w:r>
-        <w:t xml:space="preserve"> </w:t>
-      </w:r>
-      <w:r>
-        <w:t xml:space="preserve">Are Better, but at What Cost?”</w:t>
+        <w:t xml:space="preserve">“</w:t>
+      </w:r>
+      <w:r>
+        <w:t xml:space="preserve">The Embedder’s Dilemma: LLMs Are Better, but at What Cost?</w:t>
+      </w:r>
+      <w:r>
+        <w:t xml:space="preserve">”</w:t>
       </w:r>
       <w:r>
         <w:t xml:space="preserve"> arXiv preprint arXiv:2608.12875.</w:t>
       </w:r>
     </w:p>
-    <w:bookmarkEnd w:id="142"/>
-    <w:bookmarkStart w:id="143" w:name="ref-bala2026recall"/>
+    <w:bookmarkEnd w:id="145"/>
+    <w:bookmarkStart w:id="146" w:name="ref-bala2026recall"/>
     <w:p>
       <w:pPr>
         <w:pStyle w:val="Bibliography"/>
@@ -27038,37 +28216,13 @@
         <w:t xml:space="preserve"> </w:t>
       </w:r>
       <w:r>
-        <w:t xml:space="preserve">“Recall Is Not Enough: A</w:t>
-      </w:r>
-      <w:r>
-        <w:t xml:space="preserve"> </w:t>
-      </w:r>
-      <w:r>
-        <w:t xml:space="preserve">Reader-Context</w:t>
-      </w:r>
-      <w:r>
-        <w:t xml:space="preserve"> </w:t>
-      </w:r>
-      <w:r>
-        <w:t xml:space="preserve">Diagnostic for</w:t>
-      </w:r>
-      <w:r>
-        <w:t xml:space="preserve"> </w:t>
-      </w:r>
-      <w:r>
-        <w:t xml:space="preserve">Budget-Constrained</w:t>
-      </w:r>
-      <w:r>
-        <w:t xml:space="preserve"> </w:t>
-      </w:r>
-      <w:r>
-        <w:t xml:space="preserve">Retrieval-Augmented</w:t>
-      </w:r>
-      <w:r>
-        <w:t xml:space="preserve"> </w:t>
-      </w:r>
-      <w:r>
-        <w:t xml:space="preserve">Generation.”</w:t>
+        <w:t xml:space="preserve">“</w:t>
+      </w:r>
+      <w:r>
+        <w:t xml:space="preserve">Recall Is Not Enough: A Reader-Context Diagnostic for Budget-Constrained Retrieval-Augmented Generation</w:t>
+      </w:r>
+      <w:r>
+        <w:t xml:space="preserve">.”</w:t>
       </w:r>
       <w:r>
         <w:t xml:space="preserve"> </w:t>
@@ -27077,8 +28231,8 @@
         <w:t xml:space="preserve">arXiv preprint arXiv:2607.00725.</w:t>
       </w:r>
     </w:p>
-    <w:bookmarkEnd w:id="143"/>
-    <w:bookmarkStart w:id="145" w:name="ref-cohen1960kappa"/>
+    <w:bookmarkEnd w:id="146"/>
+    <w:bookmarkStart w:id="148" w:name="ref-cohen1960kappa"/>
     <w:p>
       <w:pPr>
         <w:pStyle w:val="Bibliography"/>
@@ -27090,7 +28244,13 @@
         <w:t xml:space="preserve"> </w:t>
       </w:r>
       <w:r>
-        <w:t xml:space="preserve">“A Coefficient of Agreement for Nominal Scales.”</w:t>
+        <w:t xml:space="preserve">“</w:t>
+      </w:r>
+      <w:r>
+        <w:t xml:space="preserve">A Coefficient of Agreement for Nominal Scales</w:t>
+      </w:r>
+      <w:r>
+        <w:t xml:space="preserve">.”</w:t>
       </w:r>
       <w:r>
         <w:t xml:space="preserve"> </w:t>
@@ -27111,7 +28271,7 @@
       <w:r>
         <w:t xml:space="preserve"> </w:t>
       </w:r>
-      <w:hyperlink r:id="rId144">
+      <w:hyperlink r:id="rId147">
         <w:r>
           <w:rPr>
             <w:rStyle w:val="Hyperlink"/>
@@ -27123,8 +28283,8 @@
         <w:t xml:space="preserve">.</w:t>
       </w:r>
     </w:p>
-    <w:bookmarkEnd w:id="145"/>
-    <w:bookmarkStart w:id="147" w:name="ref-cuconasu2025positional"/>
+    <w:bookmarkEnd w:id="148"/>
+    <w:bookmarkStart w:id="150" w:name="ref-cuconasu2025positional"/>
     <w:p>
       <w:pPr>
         <w:pStyle w:val="Bibliography"/>
@@ -27136,19 +28296,13 @@
         <w:t xml:space="preserve"> </w:t>
       </w:r>
       <w:r>
-        <w:t xml:space="preserve">“Do</w:t>
-      </w:r>
-      <w:r>
-        <w:t xml:space="preserve"> </w:t>
-      </w:r>
-      <w:r>
-        <w:t xml:space="preserve">RAG</w:t>
-      </w:r>
-      <w:r>
-        <w:t xml:space="preserve"> </w:t>
-      </w:r>
-      <w:r>
-        <w:t xml:space="preserve">Systems Really Suffer from Positional Bias?”</w:t>
+        <w:t xml:space="preserve">“</w:t>
+      </w:r>
+      <w:r>
+        <w:t xml:space="preserve">Do RAG Systems Really Suffer From Positional Bias?</w:t>
+      </w:r>
+      <w:r>
+        <w:t xml:space="preserve">”</w:t>
       </w:r>
       <w:r>
         <w:t xml:space="preserve"> In</w:t>
@@ -27169,7 +28323,7 @@
       <w:r>
         <w:t xml:space="preserve"> </w:t>
       </w:r>
-      <w:hyperlink r:id="rId146">
+      <w:hyperlink r:id="rId149">
         <w:r>
           <w:rPr>
             <w:rStyle w:val="Hyperlink"/>
@@ -27181,8 +28335,8 @@
         <w:t xml:space="preserve">.</w:t>
       </w:r>
     </w:p>
-    <w:bookmarkEnd w:id="147"/>
-    <w:bookmarkStart w:id="149" w:name="ref-cuconasu2024power"/>
+    <w:bookmarkEnd w:id="150"/>
+    <w:bookmarkStart w:id="152" w:name="ref-cuconasu2024power"/>
     <w:p>
       <w:pPr>
         <w:pStyle w:val="Bibliography"/>
@@ -27194,19 +28348,13 @@
         <w:t xml:space="preserve"> </w:t>
       </w:r>
       <w:r>
-        <w:t xml:space="preserve">“The Power of Noise: Redefining Retrieval for</w:t>
-      </w:r>
-      <w:r>
-        <w:t xml:space="preserve"> </w:t>
-      </w:r>
-      <w:r>
-        <w:t xml:space="preserve">RAG</w:t>
-      </w:r>
-      <w:r>
-        <w:t xml:space="preserve"> </w:t>
-      </w:r>
-      <w:r>
-        <w:t xml:space="preserve">Systems.”</w:t>
+        <w:t xml:space="preserve">“</w:t>
+      </w:r>
+      <w:r>
+        <w:t xml:space="preserve">The Power of Noise: Redefining Retrieval for RAG Systems</w:t>
+      </w:r>
+      <w:r>
+        <w:t xml:space="preserve">.”</w:t>
       </w:r>
       <w:r>
         <w:t xml:space="preserve"> </w:t>
@@ -27230,7 +28378,7 @@
       <w:r>
         <w:t xml:space="preserve"> </w:t>
       </w:r>
-      <w:hyperlink r:id="rId148">
+      <w:hyperlink r:id="rId151">
         <w:r>
           <w:rPr>
             <w:rStyle w:val="Hyperlink"/>
@@ -27242,8 +28390,8 @@
         <w:t xml:space="preserve">.</w:t>
       </w:r>
     </w:p>
-    <w:bookmarkEnd w:id="149"/>
-    <w:bookmarkStart w:id="151" w:name="ref-dror2018"/>
+    <w:bookmarkEnd w:id="152"/>
+    <w:bookmarkStart w:id="154" w:name="ref-dror2018"/>
     <w:p>
       <w:pPr>
         <w:pStyle w:val="Bibliography"/>
@@ -27255,7 +28403,13 @@
         <w:t xml:space="preserve"> </w:t>
       </w:r>
       <w:r>
-        <w:t xml:space="preserve">“The Hitchhiker’s Guide to Testing Statistical Significance in Natural Language Processing.”</w:t>
+        <w:t xml:space="preserve">“</w:t>
+      </w:r>
+      <w:r>
+        <w:t xml:space="preserve">The Hitchhiker’s Guide to Testing Statistical Significance in Natural Language Processing</w:t>
+      </w:r>
+      <w:r>
+        <w:t xml:space="preserve">.”</w:t>
       </w:r>
       <w:r>
         <w:t xml:space="preserve"> </w:t>
@@ -27279,7 +28433,7 @@
       <w:r>
         <w:t xml:space="preserve"> </w:t>
       </w:r>
-      <w:hyperlink r:id="rId150">
+      <w:hyperlink r:id="rId153">
         <w:r>
           <w:rPr>
             <w:rStyle w:val="Hyperlink"/>
@@ -27291,8 +28445,8 @@
         <w:t xml:space="preserve">.</w:t>
       </w:r>
     </w:p>
-    <w:bookmarkEnd w:id="151"/>
-    <w:bookmarkStart w:id="153" w:name="ref-efron1993bootstrap"/>
+    <w:bookmarkEnd w:id="154"/>
+    <w:bookmarkStart w:id="156" w:name="ref-efron1993bootstrap"/>
     <w:p>
       <w:pPr>
         <w:pStyle w:val="Bibliography"/>
@@ -27316,7 +28470,7 @@
       <w:r>
         <w:t xml:space="preserve"> </w:t>
       </w:r>
-      <w:hyperlink r:id="rId152">
+      <w:hyperlink r:id="rId155">
         <w:r>
           <w:rPr>
             <w:rStyle w:val="Hyperlink"/>
@@ -27328,8 +28482,8 @@
         <w:t xml:space="preserve">.</w:t>
       </w:r>
     </w:p>
-    <w:bookmarkEnd w:id="153"/>
-    <w:bookmarkStart w:id="155" w:name="ref-es2024ragas"/>
+    <w:bookmarkEnd w:id="156"/>
+    <w:bookmarkStart w:id="158" w:name="ref-es2024ragas"/>
     <w:p>
       <w:pPr>
         <w:pStyle w:val="Bibliography"/>
@@ -27344,10 +28498,10 @@
         <w:t xml:space="preserve">“</w:t>
       </w:r>
       <w:r>
-        <w:t xml:space="preserve">RAGAs</w:t>
-      </w:r>
-      <w:r>
-        <w:t xml:space="preserve">: Automated Evaluation of Retrieval Augmented Generation.”</w:t>
+        <w:t xml:space="preserve">RAGAs: Automated Evaluation of Retrieval Augmented Generation</w:t>
+      </w:r>
+      <w:r>
+        <w:t xml:space="preserve">.”</w:t>
       </w:r>
       <w:r>
         <w:t xml:space="preserve"> </w:t>
@@ -27371,7 +28525,7 @@
       <w:r>
         <w:t xml:space="preserve"> </w:t>
       </w:r>
-      <w:hyperlink r:id="rId154">
+      <w:hyperlink r:id="rId157">
         <w:r>
           <w:rPr>
             <w:rStyle w:val="Hyperlink"/>
@@ -27383,8 +28537,8 @@
         <w:t xml:space="preserve">.</w:t>
       </w:r>
     </w:p>
-    <w:bookmarkEnd w:id="155"/>
-    <w:bookmarkStart w:id="156" w:name="ref-ghosh2026evidence"/>
+    <w:bookmarkEnd w:id="158"/>
+    <w:bookmarkStart w:id="159" w:name="ref-ghosh2026evidence"/>
     <w:p>
       <w:pPr>
         <w:pStyle w:val="Bibliography"/>
@@ -27396,25 +28550,10 @@
         <w:t xml:space="preserve"> </w:t>
       </w:r>
       <w:r>
-        <w:t xml:space="preserve">“Assessing the Downstream Utility of</w:t>
-      </w:r>
-      <w:r>
-        <w:t xml:space="preserve"> </w:t>
-      </w:r>
-      <w:r>
-        <w:t xml:space="preserve">Evidence-Aware</w:t>
-      </w:r>
-      <w:r>
-        <w:t xml:space="preserve"> </w:t>
-      </w:r>
-      <w:r>
-        <w:t xml:space="preserve">Retrieval in</w:t>
-      </w:r>
-      <w:r>
-        <w:t xml:space="preserve"> </w:t>
-      </w:r>
-      <w:r>
-        <w:t xml:space="preserve">RAG</w:t>
+        <w:t xml:space="preserve">“</w:t>
+      </w:r>
+      <w:r>
+        <w:t xml:space="preserve">Assessing the Downstream Utility of Evidence-Aware Retrieval in RAG</w:t>
       </w:r>
       <w:r>
         <w:t xml:space="preserve">.”</w:t>
@@ -27426,8 +28565,8 @@
         <w:t xml:space="preserve">arXiv preprint arXiv:2608.26379.</w:t>
       </w:r>
     </w:p>
-    <w:bookmarkEnd w:id="156"/>
-    <w:bookmarkStart w:id="157" w:name="ref-grattafiori2024llama3"/>
+    <w:bookmarkEnd w:id="159"/>
+    <w:bookmarkStart w:id="160" w:name="ref-grattafiori2024llama3"/>
     <w:p>
       <w:pPr>
         <w:pStyle w:val="Bibliography"/>
@@ -27439,7 +28578,13 @@
         <w:t xml:space="preserve"> </w:t>
       </w:r>
       <w:r>
-        <w:t xml:space="preserve">“The Llama 3 Herd of Models.”</w:t>
+        <w:t xml:space="preserve">“</w:t>
+      </w:r>
+      <w:r>
+        <w:t xml:space="preserve">The Llama 3 Herd of Models</w:t>
+      </w:r>
+      <w:r>
+        <w:t xml:space="preserve">.”</w:t>
       </w:r>
       <w:r>
         <w:t xml:space="preserve"> </w:t>
@@ -27448,8 +28593,8 @@
         <w:t xml:space="preserve">arXiv preprint arXiv:2407.21783.</w:t>
       </w:r>
     </w:p>
-    <w:bookmarkEnd w:id="157"/>
-    <w:bookmarkStart w:id="159" w:name="ref-holm1979"/>
+    <w:bookmarkEnd w:id="160"/>
+    <w:bookmarkStart w:id="162" w:name="ref-holm1979"/>
     <w:p>
       <w:pPr>
         <w:pStyle w:val="Bibliography"/>
@@ -27482,7 +28627,7 @@
       <w:r>
         <w:t xml:space="preserve"> </w:t>
       </w:r>
-      <w:hyperlink r:id="rId158">
+      <w:hyperlink r:id="rId161">
         <w:r>
           <w:rPr>
             <w:rStyle w:val="Hyperlink"/>
@@ -27494,8 +28639,8 @@
         <w:t xml:space="preserve">.</w:t>
       </w:r>
     </w:p>
-    <w:bookmarkEnd w:id="159"/>
-    <w:bookmarkStart w:id="160" w:name="ref-hsia2025ragged"/>
+    <w:bookmarkEnd w:id="162"/>
+    <w:bookmarkStart w:id="163" w:name="ref-hsia2025ragged"/>
     <w:p>
       <w:pPr>
         <w:pStyle w:val="Bibliography"/>
@@ -27510,22 +28655,10 @@
         <w:t xml:space="preserve">“</w:t>
       </w:r>
       <w:r>
-        <w:t xml:space="preserve">RAGGED</w:t>
-      </w:r>
-      <w:r>
-        <w:t xml:space="preserve">: Towards Informed Design of Scalable and Stable</w:t>
-      </w:r>
-      <w:r>
-        <w:t xml:space="preserve"> </w:t>
-      </w:r>
-      <w:r>
-        <w:t xml:space="preserve">RAG</w:t>
-      </w:r>
-      <w:r>
-        <w:t xml:space="preserve"> </w:t>
-      </w:r>
-      <w:r>
-        <w:t xml:space="preserve">Systems.”</w:t>
+        <w:t xml:space="preserve">RAGGED: Towards Informed Design of Scalable and Stable RAG Systems</w:t>
+      </w:r>
+      <w:r>
+        <w:t xml:space="preserve">.”</w:t>
       </w:r>
       <w:r>
         <w:t xml:space="preserve"> </w:t>
@@ -27547,8 +28680,8 @@
         <w:t xml:space="preserve">.</w:t>
       </w:r>
     </w:p>
-    <w:bookmarkEnd w:id="160"/>
-    <w:bookmarkStart w:id="162" w:name="ref-izacard2021fid"/>
+    <w:bookmarkEnd w:id="163"/>
+    <w:bookmarkStart w:id="165" w:name="ref-izacard2021fid"/>
     <w:p>
       <w:pPr>
         <w:pStyle w:val="Bibliography"/>
@@ -27560,7 +28693,13 @@
         <w:t xml:space="preserve"> </w:t>
       </w:r>
       <w:r>
-        <w:t xml:space="preserve">“Leveraging Passage Retrieval with Generative Models for Open Domain Question Answering.”</w:t>
+        <w:t xml:space="preserve">“</w:t>
+      </w:r>
+      <w:r>
+        <w:t xml:space="preserve">Leveraging Passage Retrieval with Generative Models for Open Domain Question Answering</w:t>
+      </w:r>
+      <w:r>
+        <w:t xml:space="preserve">.”</w:t>
       </w:r>
       <w:r>
         <w:t xml:space="preserve"> </w:t>
@@ -27584,7 +28723,7 @@
       <w:r>
         <w:t xml:space="preserve"> </w:t>
       </w:r>
-      <w:hyperlink r:id="rId161">
+      <w:hyperlink r:id="rId164">
         <w:r>
           <w:rPr>
             <w:rStyle w:val="Hyperlink"/>
@@ -27596,8 +28735,8 @@
         <w:t xml:space="preserve">.</w:t>
       </w:r>
     </w:p>
-    <w:bookmarkEnd w:id="162"/>
-    <w:bookmarkStart w:id="163" w:name="ref-jiang2023mistral"/>
+    <w:bookmarkEnd w:id="165"/>
+    <w:bookmarkStart w:id="166" w:name="ref-jiang2023mistral"/>
     <w:p>
       <w:pPr>
         <w:pStyle w:val="Bibliography"/>
@@ -27609,7 +28748,13 @@
         <w:t xml:space="preserve"> </w:t>
       </w:r>
       <w:r>
-        <w:t xml:space="preserve">“Mistral 7B.”</w:t>
+        <w:t xml:space="preserve">“</w:t>
+      </w:r>
+      <w:r>
+        <w:t xml:space="preserve">Mistral 7B</w:t>
+      </w:r>
+      <w:r>
+        <w:t xml:space="preserve">.”</w:t>
       </w:r>
       <w:r>
         <w:t xml:space="preserve"> </w:t>
@@ -27618,8 +28763,8 @@
         <w:t xml:space="preserve">arXiv preprint arXiv:2310.06825.</w:t>
       </w:r>
     </w:p>
-    <w:bookmarkEnd w:id="163"/>
-    <w:bookmarkStart w:id="164" w:name="ref-jin2024longcontext"/>
+    <w:bookmarkEnd w:id="166"/>
+    <w:bookmarkStart w:id="167" w:name="ref-jin2024longcontext"/>
     <w:p>
       <w:pPr>
         <w:pStyle w:val="Bibliography"/>
@@ -27634,34 +28779,7 @@
         <w:t xml:space="preserve">“</w:t>
       </w:r>
       <w:r>
-        <w:t xml:space="preserve">Long-Context</w:t>
-      </w:r>
-      <w:r>
-        <w:t xml:space="preserve"> </w:t>
-      </w:r>
-      <w:r>
-        <w:t xml:space="preserve">LLMs</w:t>
-      </w:r>
-      <w:r>
-        <w:t xml:space="preserve"> </w:t>
-      </w:r>
-      <w:r>
-        <w:t xml:space="preserve">Meet</w:t>
-      </w:r>
-      <w:r>
-        <w:t xml:space="preserve"> </w:t>
-      </w:r>
-      <w:r>
-        <w:t xml:space="preserve">RAG</w:t>
-      </w:r>
-      <w:r>
-        <w:t xml:space="preserve">: Overcoming Challenges for Long Inputs in</w:t>
-      </w:r>
-      <w:r>
-        <w:t xml:space="preserve"> </w:t>
-      </w:r>
-      <w:r>
-        <w:t xml:space="preserve">RAG</w:t>
+        <w:t xml:space="preserve">Long-Context LLMs Meet RAG: Overcoming Challenges for Long Inputs in RAG</w:t>
       </w:r>
       <w:r>
         <w:t xml:space="preserve">.”</w:t>
@@ -27673,8 +28791,8 @@
         <w:t xml:space="preserve">arXiv preprint arXiv:2410.05983.</w:t>
       </w:r>
     </w:p>
-    <w:bookmarkEnd w:id="164"/>
-    <w:bookmarkStart w:id="166" w:name="ref-johnson2021faiss"/>
+    <w:bookmarkEnd w:id="167"/>
+    <w:bookmarkStart w:id="169" w:name="ref-johnson2021faiss"/>
     <w:p>
       <w:pPr>
         <w:pStyle w:val="Bibliography"/>
@@ -27689,19 +28807,7 @@
         <w:t xml:space="preserve">“</w:t>
       </w:r>
       <w:r>
-        <w:t xml:space="preserve">Billion-Scale</w:t>
-      </w:r>
-      <w:r>
-        <w:t xml:space="preserve"> </w:t>
-      </w:r>
-      <w:r>
-        <w:t xml:space="preserve">Similarity Search with</w:t>
-      </w:r>
-      <w:r>
-        <w:t xml:space="preserve"> </w:t>
-      </w:r>
-      <w:r>
-        <w:t xml:space="preserve">GPUs</w:t>
+        <w:t xml:space="preserve">Billion-Scale Similarity Search with GPUs</w:t>
       </w:r>
       <w:r>
         <w:t xml:space="preserve">.”</w:t>
@@ -27725,7 +28831,7 @@
       <w:r>
         <w:t xml:space="preserve"> </w:t>
       </w:r>
-      <w:hyperlink r:id="rId165">
+      <w:hyperlink r:id="rId168">
         <w:r>
           <w:rPr>
             <w:rStyle w:val="Hyperlink"/>
@@ -27737,8 +28843,8 @@
         <w:t xml:space="preserve">.</w:t>
       </w:r>
     </w:p>
-    <w:bookmarkEnd w:id="166"/>
-    <w:bookmarkStart w:id="168" w:name="ref-kamalloo2023"/>
+    <w:bookmarkEnd w:id="169"/>
+    <w:bookmarkStart w:id="171" w:name="ref-kamalloo2023"/>
     <w:p>
       <w:pPr>
         <w:pStyle w:val="Bibliography"/>
@@ -27750,19 +28856,13 @@
         <w:t xml:space="preserve"> </w:t>
       </w:r>
       <w:r>
-        <w:t xml:space="preserve">“Evaluating</w:t>
-      </w:r>
-      <w:r>
-        <w:t xml:space="preserve"> </w:t>
-      </w:r>
-      <w:r>
-        <w:t xml:space="preserve">Open-Domain</w:t>
-      </w:r>
-      <w:r>
-        <w:t xml:space="preserve"> </w:t>
-      </w:r>
-      <w:r>
-        <w:t xml:space="preserve">Question Answering in the Era of Large Language Models.”</w:t>
+        <w:t xml:space="preserve">“</w:t>
+      </w:r>
+      <w:r>
+        <w:t xml:space="preserve">Evaluating Open-Domain Question Answering in the Era of Large Language Models</w:t>
+      </w:r>
+      <w:r>
+        <w:t xml:space="preserve">.”</w:t>
       </w:r>
       <w:r>
         <w:t xml:space="preserve"> </w:t>
@@ -27786,7 +28886,7 @@
       <w:r>
         <w:t xml:space="preserve"> </w:t>
       </w:r>
-      <w:hyperlink r:id="rId167">
+      <w:hyperlink r:id="rId170">
         <w:r>
           <w:rPr>
             <w:rStyle w:val="Hyperlink"/>
@@ -27798,8 +28898,8 @@
         <w:t xml:space="preserve">.</w:t>
       </w:r>
     </w:p>
-    <w:bookmarkEnd w:id="168"/>
-    <w:bookmarkStart w:id="170" w:name="ref-karpukhin2020dpr"/>
+    <w:bookmarkEnd w:id="171"/>
+    <w:bookmarkStart w:id="173" w:name="ref-karpukhin2020dpr"/>
     <w:p>
       <w:pPr>
         <w:pStyle w:val="Bibliography"/>
@@ -27811,19 +28911,13 @@
         <w:t xml:space="preserve"> </w:t>
       </w:r>
       <w:r>
-        <w:t xml:space="preserve">“Dense Passage Retrieval for</w:t>
-      </w:r>
-      <w:r>
-        <w:t xml:space="preserve"> </w:t>
-      </w:r>
-      <w:r>
-        <w:t xml:space="preserve">Open-Domain</w:t>
-      </w:r>
-      <w:r>
-        <w:t xml:space="preserve"> </w:t>
-      </w:r>
-      <w:r>
-        <w:t xml:space="preserve">Question Answering.”</w:t>
+        <w:t xml:space="preserve">“</w:t>
+      </w:r>
+      <w:r>
+        <w:t xml:space="preserve">Dense Passage Retrieval for Open-Domain Question Answering</w:t>
+      </w:r>
+      <w:r>
+        <w:t xml:space="preserve">.”</w:t>
       </w:r>
       <w:r>
         <w:t xml:space="preserve"> </w:t>
@@ -27847,7 +28941,7 @@
       <w:r>
         <w:t xml:space="preserve"> </w:t>
       </w:r>
-      <w:hyperlink r:id="rId169">
+      <w:hyperlink r:id="rId172">
         <w:r>
           <w:rPr>
             <w:rStyle w:val="Hyperlink"/>
@@ -27859,8 +28953,8 @@
         <w:t xml:space="preserve">.</w:t>
       </w:r>
     </w:p>
-    <w:bookmarkEnd w:id="170"/>
-    <w:bookmarkStart w:id="172" w:name="ref-kwiatkowski2019nq"/>
+    <w:bookmarkEnd w:id="173"/>
+    <w:bookmarkStart w:id="175" w:name="ref-kwiatkowski2019nq"/>
     <w:p>
       <w:pPr>
         <w:pStyle w:val="Bibliography"/>
@@ -27872,7 +28966,13 @@
         <w:t xml:space="preserve"> </w:t>
       </w:r>
       <w:r>
-        <w:t xml:space="preserve">“Natural Questions: A Benchmark for Question Answering Research.”</w:t>
+        <w:t xml:space="preserve">“</w:t>
+      </w:r>
+      <w:r>
+        <w:t xml:space="preserve">Natural Questions: A Benchmark for Question Answering Research</w:t>
+      </w:r>
+      <w:r>
+        <w:t xml:space="preserve">.”</w:t>
       </w:r>
       <w:r>
         <w:t xml:space="preserve"> </w:t>
@@ -27893,7 +28993,7 @@
       <w:r>
         <w:t xml:space="preserve"> </w:t>
       </w:r>
-      <w:hyperlink r:id="rId171">
+      <w:hyperlink r:id="rId174">
         <w:r>
           <w:rPr>
             <w:rStyle w:val="Hyperlink"/>
@@ -27905,8 +29005,8 @@
         <w:t xml:space="preserve">.</w:t>
       </w:r>
     </w:p>
-    <w:bookmarkEnd w:id="172"/>
-    <w:bookmarkStart w:id="174" w:name="ref-kwon2023vllm"/>
+    <w:bookmarkEnd w:id="175"/>
+    <w:bookmarkStart w:id="177" w:name="ref-kwon2023vllm"/>
     <w:p>
       <w:pPr>
         <w:pStyle w:val="Bibliography"/>
@@ -27918,13 +29018,10 @@
         <w:t xml:space="preserve"> </w:t>
       </w:r>
       <w:r>
-        <w:t xml:space="preserve">“Efficient Memory Management for Large Language Model Serving with</w:t>
-      </w:r>
-      <w:r>
-        <w:t xml:space="preserve"> </w:t>
-      </w:r>
-      <w:r>
-        <w:t xml:space="preserve">PagedAttention</w:t>
+        <w:t xml:space="preserve">“</w:t>
+      </w:r>
+      <w:r>
+        <w:t xml:space="preserve">Efficient Memory Management for Large Language Model Serving with PagedAttention</w:t>
       </w:r>
       <w:r>
         <w:t xml:space="preserve">.”</w:t>
@@ -27951,7 +29048,7 @@
       <w:r>
         <w:t xml:space="preserve"> </w:t>
       </w:r>
-      <w:hyperlink r:id="rId173">
+      <w:hyperlink r:id="rId176">
         <w:r>
           <w:rPr>
             <w:rStyle w:val="Hyperlink"/>
@@ -27963,8 +29060,8 @@
         <w:t xml:space="preserve">.</w:t>
       </w:r>
     </w:p>
-    <w:bookmarkEnd w:id="174"/>
-    <w:bookmarkStart w:id="176" w:name="ref-landis1977"/>
+    <w:bookmarkEnd w:id="177"/>
+    <w:bookmarkStart w:id="179" w:name="ref-landis1977"/>
     <w:p>
       <w:pPr>
         <w:pStyle w:val="Bibliography"/>
@@ -27976,7 +29073,13 @@
         <w:t xml:space="preserve"> </w:t>
       </w:r>
       <w:r>
-        <w:t xml:space="preserve">“The Measurement of Observer Agreement for Categorical Data.”</w:t>
+        <w:t xml:space="preserve">“</w:t>
+      </w:r>
+      <w:r>
+        <w:t xml:space="preserve">The Measurement of Observer Agreement for Categorical Data</w:t>
+      </w:r>
+      <w:r>
+        <w:t xml:space="preserve">.”</w:t>
       </w:r>
       <w:r>
         <w:t xml:space="preserve"> </w:t>
@@ -27997,7 +29100,7 @@
       <w:r>
         <w:t xml:space="preserve"> </w:t>
       </w:r>
-      <w:hyperlink r:id="rId175">
+      <w:hyperlink r:id="rId178">
         <w:r>
           <w:rPr>
             <w:rStyle w:val="Hyperlink"/>
@@ -28009,8 +29112,8 @@
         <w:t xml:space="preserve">.</w:t>
       </w:r>
     </w:p>
-    <w:bookmarkEnd w:id="176"/>
-    <w:bookmarkStart w:id="178" w:name="ref-lee2019orqa"/>
+    <w:bookmarkEnd w:id="179"/>
+    <w:bookmarkStart w:id="181" w:name="ref-lee2019orqa"/>
     <w:p>
       <w:pPr>
         <w:pStyle w:val="Bibliography"/>
@@ -28022,7 +29125,13 @@
         <w:t xml:space="preserve"> </w:t>
       </w:r>
       <w:r>
-        <w:t xml:space="preserve">“Latent Retrieval for Weakly Supervised Open Domain Question Answering.”</w:t>
+        <w:t xml:space="preserve">“</w:t>
+      </w:r>
+      <w:r>
+        <w:t xml:space="preserve">Latent Retrieval for Weakly Supervised Open Domain Question Answering</w:t>
+      </w:r>
+      <w:r>
+        <w:t xml:space="preserve">.”</w:t>
       </w:r>
       <w:r>
         <w:t xml:space="preserve"> </w:t>
@@ -28046,7 +29155,7 @@
       <w:r>
         <w:t xml:space="preserve"> </w:t>
       </w:r>
-      <w:hyperlink r:id="rId177">
+      <w:hyperlink r:id="rId180">
         <w:r>
           <w:rPr>
             <w:rStyle w:val="Hyperlink"/>
@@ -28058,8 +29167,8 @@
         <w:t xml:space="preserve">.</w:t>
       </w:r>
     </w:p>
-    <w:bookmarkEnd w:id="178"/>
-    <w:bookmarkStart w:id="179" w:name="ref-leto2024toward"/>
+    <w:bookmarkEnd w:id="181"/>
+    <w:bookmarkStart w:id="182" w:name="ref-leto2024toward"/>
     <w:p>
       <w:pPr>
         <w:pStyle w:val="Bibliography"/>
@@ -28071,13 +29180,10 @@
         <w:t xml:space="preserve"> </w:t>
       </w:r>
       <w:r>
-        <w:t xml:space="preserve">“Toward Optimal Search and Retrieval for</w:t>
-      </w:r>
-      <w:r>
-        <w:t xml:space="preserve"> </w:t>
-      </w:r>
-      <w:r>
-        <w:t xml:space="preserve">RAG</w:t>
+        <w:t xml:space="preserve">“</w:t>
+      </w:r>
+      <w:r>
+        <w:t xml:space="preserve">Toward Optimal Search and Retrieval for RAG</w:t>
       </w:r>
       <w:r>
         <w:t xml:space="preserve">.”</w:t>
@@ -28089,8 +29195,8 @@
         <w:t xml:space="preserve">arXiv preprint arXiv:2411.07396.</w:t>
       </w:r>
     </w:p>
-    <w:bookmarkEnd w:id="179"/>
-    <w:bookmarkStart w:id="180" w:name="ref-lewis2020rag"/>
+    <w:bookmarkEnd w:id="182"/>
+    <w:bookmarkStart w:id="183" w:name="ref-lewis2020rag"/>
     <w:p>
       <w:pPr>
         <w:pStyle w:val="Bibliography"/>
@@ -28105,31 +29211,10 @@
         <w:t xml:space="preserve">“</w:t>
       </w:r>
       <w:r>
-        <w:t xml:space="preserve">Retrieval-Augmented</w:t>
-      </w:r>
-      <w:r>
-        <w:t xml:space="preserve"> </w:t>
-      </w:r>
-      <w:r>
-        <w:t xml:space="preserve">Generation for</w:t>
-      </w:r>
-      <w:r>
-        <w:t xml:space="preserve"> </w:t>
-      </w:r>
-      <w:r>
-        <w:t xml:space="preserve">Knowledge-Intensive</w:t>
-      </w:r>
-      <w:r>
-        <w:t xml:space="preserve"> </w:t>
-      </w:r>
-      <w:r>
-        <w:t xml:space="preserve">NLP</w:t>
-      </w:r>
-      <w:r>
-        <w:t xml:space="preserve"> </w:t>
-      </w:r>
-      <w:r>
-        <w:t xml:space="preserve">Tasks.”</w:t>
+        <w:t xml:space="preserve">Retrieval-Augmented Generation for Knowledge-Intensive NLP Tasks</w:t>
+      </w:r>
+      <w:r>
+        <w:t xml:space="preserve">.”</w:t>
       </w:r>
       <w:r>
         <w:t xml:space="preserve"> </w:t>
@@ -28151,8 +29236,8 @@
         <w:t xml:space="preserve">.</w:t>
       </w:r>
     </w:p>
-    <w:bookmarkEnd w:id="180"/>
-    <w:bookmarkStart w:id="182" w:name="ref-liang1986gee"/>
+    <w:bookmarkEnd w:id="183"/>
+    <w:bookmarkStart w:id="185" w:name="ref-liang1986gee"/>
     <w:p>
       <w:pPr>
         <w:pStyle w:val="Bibliography"/>
@@ -28164,7 +29249,13 @@
         <w:t xml:space="preserve"> </w:t>
       </w:r>
       <w:r>
-        <w:t xml:space="preserve">“Longitudinal Data Analysis Using Generalized Linear Models.”</w:t>
+        <w:t xml:space="preserve">“</w:t>
+      </w:r>
+      <w:r>
+        <w:t xml:space="preserve">Longitudinal data analysis using generalized linear models</w:t>
+      </w:r>
+      <w:r>
+        <w:t xml:space="preserve">.”</w:t>
       </w:r>
       <w:r>
         <w:t xml:space="preserve"> </w:t>
@@ -28185,7 +29276,7 @@
       <w:r>
         <w:t xml:space="preserve"> </w:t>
       </w:r>
-      <w:hyperlink r:id="rId181">
+      <w:hyperlink r:id="rId184">
         <w:r>
           <w:rPr>
             <w:rStyle w:val="Hyperlink"/>
@@ -28197,8 +29288,8 @@
         <w:t xml:space="preserve">.</w:t>
       </w:r>
     </w:p>
-    <w:bookmarkEnd w:id="182"/>
-    <w:bookmarkStart w:id="183" w:name="ref-lin2024awq"/>
+    <w:bookmarkEnd w:id="185"/>
+    <w:bookmarkStart w:id="186" w:name="ref-lin2024awq"/>
     <w:p>
       <w:pPr>
         <w:pStyle w:val="Bibliography"/>
@@ -28213,22 +29304,10 @@
         <w:t xml:space="preserve">“</w:t>
       </w:r>
       <w:r>
-        <w:t xml:space="preserve">AWQ</w:t>
-      </w:r>
-      <w:r>
-        <w:t xml:space="preserve">: Activation-Aware Weight Quantization for</w:t>
-      </w:r>
-      <w:r>
-        <w:t xml:space="preserve"> </w:t>
-      </w:r>
-      <w:r>
-        <w:t xml:space="preserve">LLM</w:t>
-      </w:r>
-      <w:r>
-        <w:t xml:space="preserve"> </w:t>
-      </w:r>
-      <w:r>
-        <w:t xml:space="preserve">Compression and Acceleration.”</w:t>
+        <w:t xml:space="preserve">AWQ: Activation-aware Weight Quantization for LLM Compression and Acceleration</w:t>
+      </w:r>
+      <w:r>
+        <w:t xml:space="preserve">.”</w:t>
       </w:r>
       <w:r>
         <w:t xml:space="preserve"> </w:t>
@@ -28250,8 +29329,8 @@
         <w:t xml:space="preserve">.</w:t>
       </w:r>
     </w:p>
-    <w:bookmarkEnd w:id="183"/>
-    <w:bookmarkStart w:id="185" w:name="ref-liu2024lost"/>
+    <w:bookmarkEnd w:id="186"/>
+    <w:bookmarkStart w:id="188" w:name="ref-liu2024lost"/>
     <w:p>
       <w:pPr>
         <w:pStyle w:val="Bibliography"/>
@@ -28263,7 +29342,13 @@
         <w:t xml:space="preserve"> </w:t>
       </w:r>
       <w:r>
-        <w:t xml:space="preserve">“Lost in the Middle: How Language Models Use Long Contexts.”</w:t>
+        <w:t xml:space="preserve">“</w:t>
+      </w:r>
+      <w:r>
+        <w:t xml:space="preserve">Lost in the Middle: How Language Models Use Long Contexts</w:t>
+      </w:r>
+      <w:r>
+        <w:t xml:space="preserve">.”</w:t>
       </w:r>
       <w:r>
         <w:t xml:space="preserve"> </w:t>
@@ -28284,7 +29369,7 @@
       <w:r>
         <w:t xml:space="preserve"> </w:t>
       </w:r>
-      <w:hyperlink r:id="rId184">
+      <w:hyperlink r:id="rId187">
         <w:r>
           <w:rPr>
             <w:rStyle w:val="Hyperlink"/>
@@ -28296,8 +29381,8 @@
         <w:t xml:space="preserve">.</w:t>
       </w:r>
     </w:p>
-    <w:bookmarkEnd w:id="185"/>
-    <w:bookmarkStart w:id="186" w:name="ref-lu2024bm25s"/>
+    <w:bookmarkEnd w:id="188"/>
+    <w:bookmarkStart w:id="189" w:name="ref-lu2024bm25s"/>
     <w:p>
       <w:pPr>
         <w:pStyle w:val="Bibliography"/>
@@ -28312,10 +29397,10 @@
         <w:t xml:space="preserve">“</w:t>
       </w:r>
       <w:r>
-        <w:t xml:space="preserve">BM25S</w:t>
-      </w:r>
-      <w:r>
-        <w:t xml:space="preserve">: Orders of Magnitude Faster Lexical Search via Eager Sparse Scoring.”</w:t>
+        <w:t xml:space="preserve">BM25S: Orders of magnitude faster lexical search via eager sparse scoring</w:t>
+      </w:r>
+      <w:r>
+        <w:t xml:space="preserve">.”</w:t>
       </w:r>
       <w:r>
         <w:t xml:space="preserve"> </w:t>
@@ -28324,8 +29409,8 @@
         <w:t xml:space="preserve">arXiv preprint arXiv:2407.03618.</w:t>
       </w:r>
     </w:p>
-    <w:bookmarkEnd w:id="186"/>
-    <w:bookmarkStart w:id="188" w:name="ref-lyu2025crud"/>
+    <w:bookmarkEnd w:id="189"/>
+    <w:bookmarkStart w:id="191" w:name="ref-lyu2025crud"/>
     <w:p>
       <w:pPr>
         <w:pStyle w:val="Bibliography"/>
@@ -28340,22 +29425,10 @@
         <w:t xml:space="preserve">“</w:t>
       </w:r>
       <w:r>
-        <w:t xml:space="preserve">CRUD-RAG</w:t>
-      </w:r>
-      <w:r>
-        <w:t xml:space="preserve">: A Comprehensive Chinese Benchmark for</w:t>
-      </w:r>
-      <w:r>
-        <w:t xml:space="preserve"> </w:t>
-      </w:r>
-      <w:r>
-        <w:t xml:space="preserve">Retrieval-Augmented</w:t>
-      </w:r>
-      <w:r>
-        <w:t xml:space="preserve"> </w:t>
-      </w:r>
-      <w:r>
-        <w:t xml:space="preserve">Generation of Large Language Models.”</w:t>
+        <w:t xml:space="preserve">CRUD-RAG: A Comprehensive Chinese Benchmark for Retrieval-Augmented Generation of Large Language Models</w:t>
+      </w:r>
+      <w:r>
+        <w:t xml:space="preserve">.”</w:t>
       </w:r>
       <w:r>
         <w:t xml:space="preserve"> </w:t>
@@ -28376,7 +29449,7 @@
       <w:r>
         <w:t xml:space="preserve"> </w:t>
       </w:r>
-      <w:hyperlink r:id="rId187">
+      <w:hyperlink r:id="rId190">
         <w:r>
           <w:rPr>
             <w:rStyle w:val="Hyperlink"/>
@@ -28388,8 +29461,8 @@
         <w:t xml:space="preserve">.</w:t>
       </w:r>
     </w:p>
-    <w:bookmarkEnd w:id="188"/>
-    <w:bookmarkStart w:id="190" w:name="ref-malkov2020hnsw"/>
+    <w:bookmarkEnd w:id="191"/>
+    <w:bookmarkStart w:id="193" w:name="ref-malkov2020hnsw"/>
     <w:p>
       <w:pPr>
         <w:pStyle w:val="Bibliography"/>
@@ -28401,7 +29474,13 @@
         <w:t xml:space="preserve"> </w:t>
       </w:r>
       <w:r>
-        <w:t xml:space="preserve">“Efficient and Robust Approximate Nearest Neighbor Search Using Hierarchical Navigable Small World Graphs.”</w:t>
+        <w:t xml:space="preserve">“</w:t>
+      </w:r>
+      <w:r>
+        <w:t xml:space="preserve">Efficient and Robust Approximate Nearest Neighbor Search Using Hierarchical Navigable Small World Graphs</w:t>
+      </w:r>
+      <w:r>
+        <w:t xml:space="preserve">.”</w:t>
       </w:r>
       <w:r>
         <w:t xml:space="preserve"> </w:t>
@@ -28422,7 +29501,7 @@
       <w:r>
         <w:t xml:space="preserve"> </w:t>
       </w:r>
-      <w:hyperlink r:id="rId189">
+      <w:hyperlink r:id="rId192">
         <w:r>
           <w:rPr>
             <w:rStyle w:val="Hyperlink"/>
@@ -28434,8 +29513,8 @@
         <w:t xml:space="preserve">.</w:t>
       </w:r>
     </w:p>
-    <w:bookmarkEnd w:id="190"/>
-    <w:bookmarkStart w:id="191" w:name="ref-mathur2026policy"/>
+    <w:bookmarkEnd w:id="193"/>
+    <w:bookmarkStart w:id="194" w:name="ref-mathur2026policy"/>
     <w:p>
       <w:pPr>
         <w:pStyle w:val="Bibliography"/>
@@ -28447,37 +29526,10 @@
         <w:t xml:space="preserve"> </w:t>
       </w:r>
       <w:r>
-        <w:t xml:space="preserve">“Retrieval Improvements Do Not Guarantee Better Answers: A Study of</w:t>
-      </w:r>
-      <w:r>
-        <w:t xml:space="preserve"> </w:t>
-      </w:r>
-      <w:r>
-        <w:t xml:space="preserve">RAG</w:t>
-      </w:r>
-      <w:r>
-        <w:t xml:space="preserve"> </w:t>
-      </w:r>
-      <w:r>
-        <w:t xml:space="preserve">for</w:t>
-      </w:r>
-      <w:r>
-        <w:t xml:space="preserve"> </w:t>
-      </w:r>
-      <w:r>
-        <w:t xml:space="preserve">AI</w:t>
-      </w:r>
-      <w:r>
-        <w:t xml:space="preserve"> </w:t>
-      </w:r>
-      <w:r>
-        <w:t xml:space="preserve">Policy</w:t>
-      </w:r>
-      <w:r>
-        <w:t xml:space="preserve"> </w:t>
-      </w:r>
-      <w:r>
-        <w:t xml:space="preserve">QA</w:t>
+        <w:t xml:space="preserve">“</w:t>
+      </w:r>
+      <w:r>
+        <w:t xml:space="preserve">Retrieval Improvements Do Not Guarantee Better Answers: A Study of RAG for AI Policy QA</w:t>
       </w:r>
       <w:r>
         <w:t xml:space="preserve">.”</w:t>
@@ -28489,8 +29541,8 @@
         <w:t xml:space="preserve">arXiv preprint arXiv:2603.24580.</w:t>
       </w:r>
     </w:p>
-    <w:bookmarkEnd w:id="191"/>
-    <w:bookmarkStart w:id="193" w:name="ref-mcnemar1947"/>
+    <w:bookmarkEnd w:id="194"/>
+    <w:bookmarkStart w:id="196" w:name="ref-mcnemar1947"/>
     <w:p>
       <w:pPr>
         <w:pStyle w:val="Bibliography"/>
@@ -28502,7 +29554,13 @@
         <w:t xml:space="preserve"> </w:t>
       </w:r>
       <w:r>
-        <w:t xml:space="preserve">“Note on the Sampling Error of the Difference Between Correlated Proportions or Percentages.”</w:t>
+        <w:t xml:space="preserve">“</w:t>
+      </w:r>
+      <w:r>
+        <w:t xml:space="preserve">Note on the Sampling Error of the Difference Between Correlated Proportions or Percentages</w:t>
+      </w:r>
+      <w:r>
+        <w:t xml:space="preserve">.”</w:t>
       </w:r>
       <w:r>
         <w:t xml:space="preserve"> </w:t>
@@ -28523,7 +29581,7 @@
       <w:r>
         <w:t xml:space="preserve"> </w:t>
       </w:r>
-      <w:hyperlink r:id="rId192">
+      <w:hyperlink r:id="rId195">
         <w:r>
           <w:rPr>
             <w:rStyle w:val="Hyperlink"/>
@@ -28535,8 +29593,8 @@
         <w:t xml:space="preserve">.</w:t>
       </w:r>
     </w:p>
-    <w:bookmarkEnd w:id="193"/>
-    <w:bookmarkStart w:id="194" w:name="ref-medrano2026fusion"/>
+    <w:bookmarkEnd w:id="196"/>
+    <w:bookmarkStart w:id="197" w:name="ref-medrano2026fusion"/>
     <w:p>
       <w:pPr>
         <w:pStyle w:val="Bibliography"/>
@@ -28548,19 +29606,13 @@
         <w:t xml:space="preserve"> </w:t>
       </w:r>
       <w:r>
-        <w:t xml:space="preserve">“Scaling Retrieval Augmented Generation with</w:t>
-      </w:r>
-      <w:r>
-        <w:t xml:space="preserve"> </w:t>
-      </w:r>
-      <w:r>
-        <w:t xml:space="preserve">RAG</w:t>
-      </w:r>
-      <w:r>
-        <w:t xml:space="preserve"> </w:t>
-      </w:r>
-      <w:r>
-        <w:t xml:space="preserve">Fusion: Lessons from an Industry Deployment.”</w:t>
+        <w:t xml:space="preserve">“</w:t>
+      </w:r>
+      <w:r>
+        <w:t xml:space="preserve">Scaling Retrieval Augmented Generation with RAG Fusion: Lessons from an Industry Deployment</w:t>
+      </w:r>
+      <w:r>
+        <w:t xml:space="preserve">.”</w:t>
       </w:r>
       <w:r>
         <w:t xml:space="preserve"> </w:t>
@@ -28569,8 +29621,8 @@
         <w:t xml:space="preserve">arXiv preprint arXiv:2603.02153.</w:t>
       </w:r>
     </w:p>
-    <w:bookmarkEnd w:id="194"/>
-    <w:bookmarkStart w:id="196" w:name="ref-muennighoff2023mteb"/>
+    <w:bookmarkEnd w:id="197"/>
+    <w:bookmarkStart w:id="199" w:name="ref-muennighoff2023mteb"/>
     <w:p>
       <w:pPr>
         <w:pStyle w:val="Bibliography"/>
@@ -28585,10 +29637,10 @@
         <w:t xml:space="preserve">“</w:t>
       </w:r>
       <w:r>
-        <w:t xml:space="preserve">MTEB</w:t>
-      </w:r>
-      <w:r>
-        <w:t xml:space="preserve">: Massive Text Embedding Benchmark.”</w:t>
+        <w:t xml:space="preserve">MTEB: Massive Text Embedding Benchmark</w:t>
+      </w:r>
+      <w:r>
+        <w:t xml:space="preserve">.”</w:t>
       </w:r>
       <w:r>
         <w:t xml:space="preserve"> </w:t>
@@ -28612,7 +29664,7 @@
       <w:r>
         <w:t xml:space="preserve"> </w:t>
       </w:r>
-      <w:hyperlink r:id="rId195">
+      <w:hyperlink r:id="rId198">
         <w:r>
           <w:rPr>
             <w:rStyle w:val="Hyperlink"/>
@@ -28624,8 +29676,8 @@
         <w:t xml:space="preserve">.</w:t>
       </w:r>
     </w:p>
-    <w:bookmarkEnd w:id="196"/>
-    <w:bookmarkStart w:id="197" w:name="ref-muthyam2026systems"/>
+    <w:bookmarkEnd w:id="199"/>
+    <w:bookmarkStart w:id="200" w:name="ref-muthyam2026systems"/>
     <w:p>
       <w:pPr>
         <w:pStyle w:val="Bibliography"/>
@@ -28637,31 +29689,13 @@
         <w:t xml:space="preserve"> </w:t>
       </w:r>
       <w:r>
-        <w:t xml:space="preserve">“A</w:t>
-      </w:r>
-      <w:r>
-        <w:t xml:space="preserve"> </w:t>
-      </w:r>
-      <w:r>
-        <w:t xml:space="preserve">Systems-Level</w:t>
-      </w:r>
-      <w:r>
-        <w:t xml:space="preserve"> </w:t>
-      </w:r>
-      <w:r>
-        <w:t xml:space="preserve">Analysis of Sensitivity, Robustness, and Stability in</w:t>
-      </w:r>
-      <w:r>
-        <w:t xml:space="preserve"> </w:t>
-      </w:r>
-      <w:r>
-        <w:t xml:space="preserve">Retrieval-Augmented</w:t>
-      </w:r>
-      <w:r>
-        <w:t xml:space="preserve"> </w:t>
-      </w:r>
-      <w:r>
-        <w:t xml:space="preserve">Generation.”</w:t>
+        <w:t xml:space="preserve">“</w:t>
+      </w:r>
+      <w:r>
+        <w:t xml:space="preserve">A Systems-Level Analysis of Sensitivity, Robustness, and Stability in Retrieval-Augmented Generation</w:t>
+      </w:r>
+      <w:r>
+        <w:t xml:space="preserve">.”</w:t>
       </w:r>
       <w:r>
         <w:t xml:space="preserve"> </w:t>
@@ -28670,8 +29704,8 @@
         <w:t xml:space="preserve">arXiv preprint arXiv:2606.28337.</w:t>
       </w:r>
     </w:p>
-    <w:bookmarkEnd w:id="197"/>
-    <w:bookmarkStart w:id="198" w:name="ref-nogueira2019passage"/>
+    <w:bookmarkEnd w:id="200"/>
+    <w:bookmarkStart w:id="201" w:name="ref-nogueira2019passage"/>
     <w:p>
       <w:pPr>
         <w:pStyle w:val="Bibliography"/>
@@ -28683,13 +29717,10 @@
         <w:t xml:space="preserve"> </w:t>
       </w:r>
       <w:r>
-        <w:t xml:space="preserve">“Passage Re-Ranking with</w:t>
-      </w:r>
-      <w:r>
-        <w:t xml:space="preserve"> </w:t>
-      </w:r>
-      <w:r>
-        <w:t xml:space="preserve">BERT</w:t>
+        <w:t xml:space="preserve">“</w:t>
+      </w:r>
+      <w:r>
+        <w:t xml:space="preserve">Passage Re-ranking with BERT</w:t>
       </w:r>
       <w:r>
         <w:t xml:space="preserve">.”</w:t>
@@ -28701,8 +29732,8 @@
         <w:t xml:space="preserve">arXiv preprint arXiv:1901.04085.</w:t>
       </w:r>
     </w:p>
-    <w:bookmarkEnd w:id="198"/>
-    <w:bookmarkStart w:id="200" w:name="ref-peng2026neocorrag"/>
+    <w:bookmarkEnd w:id="201"/>
+    <w:bookmarkStart w:id="203" w:name="ref-peng2026neocorrag"/>
     <w:p>
       <w:pPr>
         <w:pStyle w:val="Bibliography"/>
@@ -28717,10 +29748,10 @@
         <w:t xml:space="preserve">“</w:t>
       </w:r>
       <w:r>
-        <w:t xml:space="preserve">NeocorRAG</w:t>
-      </w:r>
-      <w:r>
-        <w:t xml:space="preserve">: Less Irrelevant Information, More Explicit Evidence, and More Effective Recall via Evidence Chains.”</w:t>
+        <w:t xml:space="preserve">NeocorRAG: Less Irrelevant Information, More Explicit Evidence, and More Effective Recall via Evidence Chains</w:t>
+      </w:r>
+      <w:r>
+        <w:t xml:space="preserve">.”</w:t>
       </w:r>
       <w:r>
         <w:t xml:space="preserve"> </w:t>
@@ -28744,7 +29775,7 @@
       <w:r>
         <w:t xml:space="preserve"> </w:t>
       </w:r>
-      <w:hyperlink r:id="rId199">
+      <w:hyperlink r:id="rId202">
         <w:r>
           <w:rPr>
             <w:rStyle w:val="Hyperlink"/>
@@ -28756,8 +29787,8 @@
         <w:t xml:space="preserve">.</w:t>
       </w:r>
     </w:p>
-    <w:bookmarkEnd w:id="200"/>
-    <w:bookmarkStart w:id="202" w:name="ref-petroni2021kilt"/>
+    <w:bookmarkEnd w:id="203"/>
+    <w:bookmarkStart w:id="205" w:name="ref-petroni2021kilt"/>
     <w:p>
       <w:pPr>
         <w:pStyle w:val="Bibliography"/>
@@ -28772,10 +29803,10 @@
         <w:t xml:space="preserve">“</w:t>
       </w:r>
       <w:r>
-        <w:t xml:space="preserve">KILT</w:t>
-      </w:r>
-      <w:r>
-        <w:t xml:space="preserve">: A Benchmark for Knowledge Intensive Language Tasks.”</w:t>
+        <w:t xml:space="preserve">KILT: a Benchmark for Knowledge Intensive Language Tasks</w:t>
+      </w:r>
+      <w:r>
+        <w:t xml:space="preserve">.”</w:t>
       </w:r>
       <w:r>
         <w:t xml:space="preserve"> </w:t>
@@ -28799,7 +29830,7 @@
       <w:r>
         <w:t xml:space="preserve"> </w:t>
       </w:r>
-      <w:hyperlink r:id="rId201">
+      <w:hyperlink r:id="rId204">
         <w:r>
           <w:rPr>
             <w:rStyle w:val="Hyperlink"/>
@@ -28811,8 +29842,8 @@
         <w:t xml:space="preserve">.</w:t>
       </w:r>
     </w:p>
-    <w:bookmarkEnd w:id="202"/>
-    <w:bookmarkStart w:id="203" w:name="ref-qwen2025qwen25"/>
+    <w:bookmarkEnd w:id="205"/>
+    <w:bookmarkStart w:id="206" w:name="ref-qwen2025qwen25"/>
     <w:p>
       <w:pPr>
         <w:pStyle w:val="Bibliography"/>
@@ -28827,10 +29858,10 @@
         <w:t xml:space="preserve">“</w:t>
       </w:r>
       <w:r>
-        <w:t xml:space="preserve">Qwen2</w:t>
-      </w:r>
-      <w:r>
-        <w:t xml:space="preserve">.5 Technical Report.”</w:t>
+        <w:t xml:space="preserve">Qwen2.5 Technical Report</w:t>
+      </w:r>
+      <w:r>
+        <w:t xml:space="preserve">.”</w:t>
       </w:r>
       <w:r>
         <w:t xml:space="preserve"> </w:t>
@@ -28839,8 +29870,8 @@
         <w:t xml:space="preserve">arXiv preprint arXiv:2412.15115.</w:t>
       </w:r>
     </w:p>
-    <w:bookmarkEnd w:id="203"/>
-    <w:bookmarkStart w:id="205" w:name="ref-ram2023incontext"/>
+    <w:bookmarkEnd w:id="206"/>
+    <w:bookmarkStart w:id="208" w:name="ref-ram2023incontext"/>
     <w:p>
       <w:pPr>
         <w:pStyle w:val="Bibliography"/>
@@ -28855,19 +29886,10 @@
         <w:t xml:space="preserve">“</w:t>
       </w:r>
       <w:r>
-        <w:t xml:space="preserve">In-Context</w:t>
-      </w:r>
-      <w:r>
-        <w:t xml:space="preserve"> </w:t>
-      </w:r>
-      <w:r>
-        <w:t xml:space="preserve">Retrieval-Augmented</w:t>
-      </w:r>
-      <w:r>
-        <w:t xml:space="preserve"> </w:t>
-      </w:r>
-      <w:r>
-        <w:t xml:space="preserve">Language Models.”</w:t>
+        <w:t xml:space="preserve">In-Context Retrieval-Augmented Language Models</w:t>
+      </w:r>
+      <w:r>
+        <w:t xml:space="preserve">.”</w:t>
       </w:r>
       <w:r>
         <w:t xml:space="preserve"> </w:t>
@@ -28888,7 +29910,7 @@
       <w:r>
         <w:t xml:space="preserve"> </w:t>
       </w:r>
-      <w:hyperlink r:id="rId204">
+      <w:hyperlink r:id="rId207">
         <w:r>
           <w:rPr>
             <w:rStyle w:val="Hyperlink"/>
@@ -28900,8 +29922,8 @@
         <w:t xml:space="preserve">.</w:t>
       </w:r>
     </w:p>
-    <w:bookmarkEnd w:id="205"/>
-    <w:bookmarkStart w:id="207" w:name="ref-rau2024bergen"/>
+    <w:bookmarkEnd w:id="208"/>
+    <w:bookmarkStart w:id="210" w:name="ref-rau2024bergen"/>
     <w:p>
       <w:pPr>
         <w:pStyle w:val="Bibliography"/>
@@ -28916,22 +29938,10 @@
         <w:t xml:space="preserve">“</w:t>
       </w:r>
       <w:r>
-        <w:t xml:space="preserve">BERGEN</w:t>
-      </w:r>
-      <w:r>
-        <w:t xml:space="preserve">: A Benchmarking Library for</w:t>
-      </w:r>
-      <w:r>
-        <w:t xml:space="preserve"> </w:t>
-      </w:r>
-      <w:r>
-        <w:t xml:space="preserve">Retrieval-Augmented</w:t>
-      </w:r>
-      <w:r>
-        <w:t xml:space="preserve"> </w:t>
-      </w:r>
-      <w:r>
-        <w:t xml:space="preserve">Generation.”</w:t>
+        <w:t xml:space="preserve">BERGEN: A Benchmarking Library for Retrieval-Augmented Generation</w:t>
+      </w:r>
+      <w:r>
+        <w:t xml:space="preserve">.”</w:t>
       </w:r>
       <w:r>
         <w:t xml:space="preserve"> </w:t>
@@ -28955,7 +29965,7 @@
       <w:r>
         <w:t xml:space="preserve"> </w:t>
       </w:r>
-      <w:hyperlink r:id="rId206">
+      <w:hyperlink r:id="rId209">
         <w:r>
           <w:rPr>
             <w:rStyle w:val="Hyperlink"/>
@@ -28967,8 +29977,8 @@
         <w:t xml:space="preserve">.</w:t>
       </w:r>
     </w:p>
-    <w:bookmarkEnd w:id="207"/>
-    <w:bookmarkStart w:id="209" w:name="ref-reimers2019sbert"/>
+    <w:bookmarkEnd w:id="210"/>
+    <w:bookmarkStart w:id="212" w:name="ref-reimers2019sbert"/>
     <w:p>
       <w:pPr>
         <w:pStyle w:val="Bibliography"/>
@@ -28983,16 +29993,7 @@
         <w:t xml:space="preserve">“</w:t>
       </w:r>
       <w:r>
-        <w:t xml:space="preserve">Sentence-BERT</w:t>
-      </w:r>
-      <w:r>
-        <w:t xml:space="preserve">: Sentence Embeddings Using Siamese</w:t>
-      </w:r>
-      <w:r>
-        <w:t xml:space="preserve"> </w:t>
-      </w:r>
-      <w:r>
-        <w:t xml:space="preserve">BERT-Networks</w:t>
+        <w:t xml:space="preserve">Sentence-BERT: Sentence Embeddings using Siamese BERT-Networks</w:t>
       </w:r>
       <w:r>
         <w:t xml:space="preserve">.”</w:t>
@@ -29019,7 +30020,7 @@
       <w:r>
         <w:t xml:space="preserve"> </w:t>
       </w:r>
-      <w:hyperlink r:id="rId208">
+      <w:hyperlink r:id="rId211">
         <w:r>
           <w:rPr>
             <w:rStyle w:val="Hyperlink"/>
@@ -29031,8 +30032,8 @@
         <w:t xml:space="preserve">.</w:t>
       </w:r>
     </w:p>
-    <w:bookmarkEnd w:id="209"/>
-    <w:bookmarkStart w:id="210" w:name="ref-repantis2026competition"/>
+    <w:bookmarkEnd w:id="212"/>
+    <w:bookmarkStart w:id="213" w:name="ref-repantis2026competition"/>
     <w:p>
       <w:pPr>
         <w:pStyle w:val="Bibliography"/>
@@ -29044,19 +30045,13 @@
         <w:t xml:space="preserve"> </w:t>
       </w:r>
       <w:r>
-        <w:t xml:space="preserve">“Separating Semantic Competition from Context Length in</w:t>
-      </w:r>
-      <w:r>
-        <w:t xml:space="preserve"> </w:t>
-      </w:r>
-      <w:r>
-        <w:t xml:space="preserve">RAG</w:t>
-      </w:r>
-      <w:r>
-        <w:t xml:space="preserve"> </w:t>
-      </w:r>
-      <w:r>
-        <w:t xml:space="preserve">Reading.”</w:t>
+        <w:t xml:space="preserve">“</w:t>
+      </w:r>
+      <w:r>
+        <w:t xml:space="preserve">Separating Semantic Competition from Context Length in RAG Reading</w:t>
+      </w:r>
+      <w:r>
+        <w:t xml:space="preserve">.”</w:t>
       </w:r>
       <w:r>
         <w:t xml:space="preserve"> </w:t>
@@ -29065,8 +30060,8 @@
         <w:t xml:space="preserve">arXiv preprint arXiv:2605.27294.</w:t>
       </w:r>
     </w:p>
-    <w:bookmarkEnd w:id="210"/>
-    <w:bookmarkStart w:id="212" w:name="ref-robertson2009bm25"/>
+    <w:bookmarkEnd w:id="213"/>
+    <w:bookmarkStart w:id="215" w:name="ref-robertson2009bm25"/>
     <w:p>
       <w:pPr>
         <w:pStyle w:val="Bibliography"/>
@@ -29078,19 +30073,13 @@
         <w:t xml:space="preserve"> </w:t>
       </w:r>
       <w:r>
-        <w:t xml:space="preserve">“The Probabilistic Relevance Framework:</w:t>
-      </w:r>
-      <w:r>
-        <w:t xml:space="preserve"> </w:t>
-      </w:r>
-      <w:r>
-        <w:t xml:space="preserve">BM25</w:t>
-      </w:r>
-      <w:r>
-        <w:t xml:space="preserve"> </w:t>
-      </w:r>
-      <w:r>
-        <w:t xml:space="preserve">and Beyond.”</w:t>
+        <w:t xml:space="preserve">“</w:t>
+      </w:r>
+      <w:r>
+        <w:t xml:space="preserve">The Probabilistic Relevance Framework: BM25 and Beyond</w:t>
+      </w:r>
+      <w:r>
+        <w:t xml:space="preserve">.”</w:t>
       </w:r>
       <w:r>
         <w:t xml:space="preserve"> </w:t>
@@ -29111,7 +30100,7 @@
       <w:r>
         <w:t xml:space="preserve"> </w:t>
       </w:r>
-      <w:hyperlink r:id="rId211">
+      <w:hyperlink r:id="rId214">
         <w:r>
           <w:rPr>
             <w:rStyle w:val="Hyperlink"/>
@@ -29123,8 +30112,8 @@
         <w:t xml:space="preserve">.</w:t>
       </w:r>
     </w:p>
-    <w:bookmarkEnd w:id="212"/>
-    <w:bookmarkStart w:id="214" w:name="ref-saadfalcon2024ares"/>
+    <w:bookmarkEnd w:id="215"/>
+    <w:bookmarkStart w:id="217" w:name="ref-saadfalcon2024ares"/>
     <w:p>
       <w:pPr>
         <w:pStyle w:val="Bibliography"/>
@@ -29139,22 +30128,10 @@
         <w:t xml:space="preserve">“</w:t>
       </w:r>
       <w:r>
-        <w:t xml:space="preserve">ARES</w:t>
-      </w:r>
-      <w:r>
-        <w:t xml:space="preserve">: An Automated Evaluation Framework for</w:t>
-      </w:r>
-      <w:r>
-        <w:t xml:space="preserve"> </w:t>
-      </w:r>
-      <w:r>
-        <w:t xml:space="preserve">Retrieval-Augmented</w:t>
-      </w:r>
-      <w:r>
-        <w:t xml:space="preserve"> </w:t>
-      </w:r>
-      <w:r>
-        <w:t xml:space="preserve">Generation Systems.”</w:t>
+        <w:t xml:space="preserve">ARES: An Automated Evaluation Framework for Retrieval-Augmented Generation Systems</w:t>
+      </w:r>
+      <w:r>
+        <w:t xml:space="preserve">.”</w:t>
       </w:r>
       <w:r>
         <w:t xml:space="preserve"> </w:t>
@@ -29178,7 +30155,7 @@
       <w:r>
         <w:t xml:space="preserve"> </w:t>
       </w:r>
-      <w:hyperlink r:id="rId213">
+      <w:hyperlink r:id="rId216">
         <w:r>
           <w:rPr>
             <w:rStyle w:val="Hyperlink"/>
@@ -29190,8 +30167,8 @@
         <w:t xml:space="preserve">.</w:t>
       </w:r>
     </w:p>
-    <w:bookmarkEnd w:id="214"/>
-    <w:bookmarkStart w:id="216" w:name="ref-sakai2014"/>
+    <w:bookmarkEnd w:id="217"/>
+    <w:bookmarkStart w:id="219" w:name="ref-sakai2014"/>
     <w:p>
       <w:pPr>
         <w:pStyle w:val="Bibliography"/>
@@ -29203,7 +30180,13 @@
         <w:t xml:space="preserve"> </w:t>
       </w:r>
       <w:r>
-        <w:t xml:space="preserve">“Statistical Reform in Information Retrieval?”</w:t>
+        <w:t xml:space="preserve">“</w:t>
+      </w:r>
+      <w:r>
+        <w:t xml:space="preserve">Statistical reform in information retrieval?</w:t>
+      </w:r>
+      <w:r>
+        <w:t xml:space="preserve">”</w:t>
       </w:r>
       <w:r>
         <w:t xml:space="preserve"> </w:t>
@@ -29224,7 +30207,7 @@
       <w:r>
         <w:t xml:space="preserve"> </w:t>
       </w:r>
-      <w:hyperlink r:id="rId215">
+      <w:hyperlink r:id="rId218">
         <w:r>
           <w:rPr>
             <w:rStyle w:val="Hyperlink"/>
@@ -29236,8 +30219,8 @@
         <w:t xml:space="preserve">.</w:t>
       </w:r>
     </w:p>
-    <w:bookmarkEnd w:id="216"/>
-    <w:bookmarkStart w:id="218" w:name="ref-salemi2024erag"/>
+    <w:bookmarkEnd w:id="219"/>
+    <w:bookmarkStart w:id="221" w:name="ref-salemi2024erag"/>
     <w:p>
       <w:pPr>
         <w:pStyle w:val="Bibliography"/>
@@ -29249,19 +30232,13 @@
         <w:t xml:space="preserve"> </w:t>
       </w:r>
       <w:r>
-        <w:t xml:space="preserve">“Evaluating Retrieval Quality in</w:t>
-      </w:r>
-      <w:r>
-        <w:t xml:space="preserve"> </w:t>
-      </w:r>
-      <w:r>
-        <w:t xml:space="preserve">Retrieval-Augmented</w:t>
-      </w:r>
-      <w:r>
-        <w:t xml:space="preserve"> </w:t>
-      </w:r>
-      <w:r>
-        <w:t xml:space="preserve">Generation.”</w:t>
+        <w:t xml:space="preserve">“</w:t>
+      </w:r>
+      <w:r>
+        <w:t xml:space="preserve">Evaluating Retrieval Quality in Retrieval-Augmented Generation</w:t>
+      </w:r>
+      <w:r>
+        <w:t xml:space="preserve">.”</w:t>
       </w:r>
       <w:r>
         <w:t xml:space="preserve"> </w:t>
@@ -29285,7 +30262,7 @@
       <w:r>
         <w:t xml:space="preserve"> </w:t>
       </w:r>
-      <w:hyperlink r:id="rId217">
+      <w:hyperlink r:id="rId220">
         <w:r>
           <w:rPr>
             <w:rStyle w:val="Hyperlink"/>
@@ -29297,8 +30274,8 @@
         <w:t xml:space="preserve">.</w:t>
       </w:r>
     </w:p>
-    <w:bookmarkEnd w:id="218"/>
-    <w:bookmarkStart w:id="220" w:name="ref-samuel2026beyond"/>
+    <w:bookmarkEnd w:id="221"/>
+    <w:bookmarkStart w:id="223" w:name="ref-samuel2026beyond"/>
     <w:p>
       <w:pPr>
         <w:pStyle w:val="Bibliography"/>
@@ -29310,19 +30287,13 @@
         <w:t xml:space="preserve"> </w:t>
       </w:r>
       <w:r>
-        <w:t xml:space="preserve">“Beyond Relevance: On the Relationship Between Retrieval and</w:t>
-      </w:r>
-      <w:r>
-        <w:t xml:space="preserve"> </w:t>
-      </w:r>
-      <w:r>
-        <w:t xml:space="preserve">RAG</w:t>
-      </w:r>
-      <w:r>
-        <w:t xml:space="preserve"> </w:t>
-      </w:r>
-      <w:r>
-        <w:t xml:space="preserve">Information Coverage.”</w:t>
+        <w:t xml:space="preserve">“</w:t>
+      </w:r>
+      <w:r>
+        <w:t xml:space="preserve">Beyond Relevance: On the Relationship Between Retrieval and RAG Information Coverage</w:t>
+      </w:r>
+      <w:r>
+        <w:t xml:space="preserve">.”</w:t>
       </w:r>
       <w:r>
         <w:t xml:space="preserve"> </w:t>
@@ -29346,7 +30317,7 @@
       <w:r>
         <w:t xml:space="preserve"> </w:t>
       </w:r>
-      <w:hyperlink r:id="rId219">
+      <w:hyperlink r:id="rId222">
         <w:r>
           <w:rPr>
             <w:rStyle w:val="Hyperlink"/>
@@ -29358,8 +30329,8 @@
         <w:t xml:space="preserve">.</w:t>
       </w:r>
     </w:p>
-    <w:bookmarkEnd w:id="220"/>
-    <w:bookmarkStart w:id="221" w:name="ref-shi2023distracted"/>
+    <w:bookmarkEnd w:id="223"/>
+    <w:bookmarkStart w:id="224" w:name="ref-shi2023distracted"/>
     <w:p>
       <w:pPr>
         <w:pStyle w:val="Bibliography"/>
@@ -29371,7 +30342,13 @@
         <w:t xml:space="preserve"> </w:t>
       </w:r>
       <w:r>
-        <w:t xml:space="preserve">“Large Language Models Can Be Easily Distracted by Irrelevant Context.”</w:t>
+        <w:t xml:space="preserve">“</w:t>
+      </w:r>
+      <w:r>
+        <w:t xml:space="preserve">Large Language Models Can Be Easily Distracted by Irrelevant Context</w:t>
+      </w:r>
+      <w:r>
+        <w:t xml:space="preserve">.”</w:t>
       </w:r>
       <w:r>
         <w:t xml:space="preserve"> </w:t>
@@ -29393,8 +30370,8 @@
         <w:t xml:space="preserve">, 202:31210–27. PMLR.</w:t>
       </w:r>
     </w:p>
-    <w:bookmarkEnd w:id="221"/>
-    <w:bookmarkStart w:id="223" w:name="ref-smucker2007"/>
+    <w:bookmarkEnd w:id="224"/>
+    <w:bookmarkStart w:id="226" w:name="ref-smucker2007"/>
     <w:p>
       <w:pPr>
         <w:pStyle w:val="Bibliography"/>
@@ -29406,7 +30383,13 @@
         <w:t xml:space="preserve"> </w:t>
       </w:r>
       <w:r>
-        <w:t xml:space="preserve">“A Comparison of Statistical Significance Tests for Information Retrieval Evaluation.”</w:t>
+        <w:t xml:space="preserve">“</w:t>
+      </w:r>
+      <w:r>
+        <w:t xml:space="preserve">A comparison of statistical significance tests for information retrieval evaluation</w:t>
+      </w:r>
+      <w:r>
+        <w:t xml:space="preserve">.”</w:t>
       </w:r>
       <w:r>
         <w:t xml:space="preserve"> </w:t>
@@ -29430,7 +30413,7 @@
       <w:r>
         <w:t xml:space="preserve"> </w:t>
       </w:r>
-      <w:hyperlink r:id="rId222">
+      <w:hyperlink r:id="rId225">
         <w:r>
           <w:rPr>
             <w:rStyle w:val="Hyperlink"/>
@@ -29442,8 +30425,8 @@
         <w:t xml:space="preserve">.</w:t>
       </w:r>
     </w:p>
-    <w:bookmarkEnd w:id="223"/>
-    <w:bookmarkStart w:id="224" w:name="ref-thakur2021beir"/>
+    <w:bookmarkEnd w:id="226"/>
+    <w:bookmarkStart w:id="227" w:name="ref-thakur2021beir"/>
     <w:p>
       <w:pPr>
         <w:pStyle w:val="Bibliography"/>
@@ -29458,10 +30441,10 @@
         <w:t xml:space="preserve">“</w:t>
       </w:r>
       <w:r>
-        <w:t xml:space="preserve">BEIR</w:t>
-      </w:r>
-      <w:r>
-        <w:t xml:space="preserve">: A Heterogenous Benchmark for Zero-Shot Evaluation of Information Retrieval Models.”</w:t>
+        <w:t xml:space="preserve">BEIR: A Heterogenous Benchmark for Zero-shot Evaluation of Information Retrieval Models</w:t>
+      </w:r>
+      <w:r>
+        <w:t xml:space="preserve">.”</w:t>
       </w:r>
       <w:r>
         <w:t xml:space="preserve"> </w:t>
@@ -29470,8 +30453,8 @@
         <w:t xml:space="preserve">arXiv preprint arXiv:2104.08663.</w:t>
       </w:r>
     </w:p>
-    <w:bookmarkEnd w:id="224"/>
-    <w:bookmarkStart w:id="225" w:name="ref-trappolini2025udcg"/>
+    <w:bookmarkEnd w:id="227"/>
+    <w:bookmarkStart w:id="228" w:name="ref-trappolini2025udcg"/>
     <w:p>
       <w:pPr>
         <w:pStyle w:val="Bibliography"/>
@@ -29483,13 +30466,10 @@
         <w:t xml:space="preserve"> </w:t>
       </w:r>
       <w:r>
-        <w:t xml:space="preserve">“Redefining Retrieval Evaluation in the Era of</w:t>
-      </w:r>
-      <w:r>
-        <w:t xml:space="preserve"> </w:t>
-      </w:r>
-      <w:r>
-        <w:t xml:space="preserve">LLMs</w:t>
+        <w:t xml:space="preserve">“</w:t>
+      </w:r>
+      <w:r>
+        <w:t xml:space="preserve">Redefining Retrieval Evaluation in the Era of LLMs</w:t>
       </w:r>
       <w:r>
         <w:t xml:space="preserve">.”</w:t>
@@ -29501,8 +30481,8 @@
         <w:t xml:space="preserve">arXiv preprint arXiv:2510.21440.</w:t>
       </w:r>
     </w:p>
-    <w:bookmarkEnd w:id="225"/>
-    <w:bookmarkStart w:id="226" w:name="ref-wang2022e5"/>
+    <w:bookmarkEnd w:id="228"/>
+    <w:bookmarkStart w:id="229" w:name="ref-wang2022e5"/>
     <w:p>
       <w:pPr>
         <w:pStyle w:val="Bibliography"/>
@@ -29514,19 +30494,13 @@
         <w:t xml:space="preserve"> </w:t>
       </w:r>
       <w:r>
-        <w:t xml:space="preserve">“Text Embeddings by</w:t>
-      </w:r>
-      <w:r>
-        <w:t xml:space="preserve"> </w:t>
-      </w:r>
-      <w:r>
-        <w:t xml:space="preserve">Weakly-Supervised</w:t>
-      </w:r>
-      <w:r>
-        <w:t xml:space="preserve"> </w:t>
-      </w:r>
-      <w:r>
-        <w:t xml:space="preserve">Contrastive Pre-Training.”</w:t>
+        <w:t xml:space="preserve">“</w:t>
+      </w:r>
+      <w:r>
+        <w:t xml:space="preserve">Text Embeddings by Weakly-Supervised Contrastive Pre-training</w:t>
+      </w:r>
+      <w:r>
+        <w:t xml:space="preserve">.”</w:t>
       </w:r>
       <w:r>
         <w:t xml:space="preserve"> </w:t>
@@ -29535,8 +30509,8 @@
         <w:t xml:space="preserve">arXiv preprint arXiv:2212.03533.</w:t>
       </w:r>
     </w:p>
-    <w:bookmarkEnd w:id="226"/>
-    <w:bookmarkStart w:id="227" w:name="ref-wang2020minilm"/>
+    <w:bookmarkEnd w:id="229"/>
+    <w:bookmarkStart w:id="230" w:name="ref-wang2020minilm"/>
     <w:p>
       <w:pPr>
         <w:pStyle w:val="Bibliography"/>
@@ -29551,46 +30525,10 @@
         <w:t xml:space="preserve">“</w:t>
       </w:r>
       <w:r>
-        <w:t xml:space="preserve">MiniLM</w:t>
-      </w:r>
-      <w:r>
-        <w:t xml:space="preserve">: Deep</w:t>
-      </w:r>
-      <w:r>
-        <w:t xml:space="preserve"> </w:t>
-      </w:r>
-      <w:r>
-        <w:t xml:space="preserve">Self-Attention</w:t>
-      </w:r>
-      <w:r>
-        <w:t xml:space="preserve"> </w:t>
-      </w:r>
-      <w:r>
-        <w:t xml:space="preserve">Distillation for</w:t>
-      </w:r>
-      <w:r>
-        <w:t xml:space="preserve"> </w:t>
-      </w:r>
-      <w:r>
-        <w:t xml:space="preserve">Task-Agnostic</w:t>
-      </w:r>
-      <w:r>
-        <w:t xml:space="preserve"> </w:t>
-      </w:r>
-      <w:r>
-        <w:t xml:space="preserve">Compression of</w:t>
-      </w:r>
-      <w:r>
-        <w:t xml:space="preserve"> </w:t>
-      </w:r>
-      <w:r>
-        <w:t xml:space="preserve">Pre-Trained</w:t>
-      </w:r>
-      <w:r>
-        <w:t xml:space="preserve"> </w:t>
-      </w:r>
-      <w:r>
-        <w:t xml:space="preserve">Transformers.”</w:t>
+        <w:t xml:space="preserve">MiniLM: Deep Self-Attention Distillation for Task-Agnostic Compression of Pre-Trained Transformers</w:t>
+      </w:r>
+      <w:r>
+        <w:t xml:space="preserve">.”</w:t>
       </w:r>
       <w:r>
         <w:t xml:space="preserve"> </w:t>
@@ -29612,8 +30550,8 @@
         <w:t xml:space="preserve">.</w:t>
       </w:r>
     </w:p>
-    <w:bookmarkEnd w:id="227"/>
-    <w:bookmarkStart w:id="229" w:name="ref-xiao2024cpack"/>
+    <w:bookmarkEnd w:id="230"/>
+    <w:bookmarkStart w:id="232" w:name="ref-xiao2024cpack"/>
     <w:p>
       <w:pPr>
         <w:pStyle w:val="Bibliography"/>
@@ -29628,10 +30566,10 @@
         <w:t xml:space="preserve">“</w:t>
       </w:r>
       <w:r>
-        <w:t xml:space="preserve">C-Pack</w:t>
-      </w:r>
-      <w:r>
-        <w:t xml:space="preserve">: Packed Resources for General Chinese Embeddings.”</w:t>
+        <w:t xml:space="preserve">C-Pack: Packed Resources For General Chinese Embeddings</w:t>
+      </w:r>
+      <w:r>
+        <w:t xml:space="preserve">.”</w:t>
       </w:r>
       <w:r>
         <w:t xml:space="preserve"> </w:t>
@@ -29655,7 +30593,7 @@
       <w:r>
         <w:t xml:space="preserve"> </w:t>
       </w:r>
-      <w:hyperlink r:id="rId228">
+      <w:hyperlink r:id="rId231">
         <w:r>
           <w:rPr>
             <w:rStyle w:val="Hyperlink"/>
@@ -29667,8 +30605,8 @@
         <w:t xml:space="preserve">.</w:t>
       </w:r>
     </w:p>
-    <w:bookmarkEnd w:id="229"/>
-    <w:bookmarkStart w:id="231" w:name="ref-yang2018hotpotqa"/>
+    <w:bookmarkEnd w:id="232"/>
+    <w:bookmarkStart w:id="234" w:name="ref-yang2018hotpotqa"/>
     <w:p>
       <w:pPr>
         <w:pStyle w:val="Bibliography"/>
@@ -29683,10 +30621,10 @@
         <w:t xml:space="preserve">“</w:t>
       </w:r>
       <w:r>
-        <w:t xml:space="preserve">HotpotQA</w:t>
-      </w:r>
-      <w:r>
-        <w:t xml:space="preserve">: A Dataset for Diverse, Explainable Multi-Hop Question Answering.”</w:t>
+        <w:t xml:space="preserve">HotpotQA: A Dataset for Diverse, Explainable Multi-hop Question Answering</w:t>
+      </w:r>
+      <w:r>
+        <w:t xml:space="preserve">.”</w:t>
       </w:r>
       <w:r>
         <w:t xml:space="preserve"> </w:t>
@@ -29710,7 +30648,7 @@
       <w:r>
         <w:t xml:space="preserve"> </w:t>
       </w:r>
-      <w:hyperlink r:id="rId230">
+      <w:hyperlink r:id="rId233">
         <w:r>
           <w:rPr>
             <w:rStyle w:val="Hyperlink"/>
@@ -29722,8 +30660,8 @@
         <w:t xml:space="preserve">.</w:t>
       </w:r>
     </w:p>
-    <w:bookmarkEnd w:id="231"/>
-    <w:bookmarkStart w:id="232" w:name="ref-zhang2025qwen3emb"/>
+    <w:bookmarkEnd w:id="234"/>
+    <w:bookmarkStart w:id="235" w:name="ref-zhang2025qwen3emb"/>
     <w:p>
       <w:pPr>
         <w:pStyle w:val="Bibliography"/>
@@ -29738,13 +30676,10 @@
         <w:t xml:space="preserve">“</w:t>
       </w:r>
       <w:r>
-        <w:t xml:space="preserve">Qwen3</w:t>
-      </w:r>
-      <w:r>
-        <w:t xml:space="preserve"> </w:t>
-      </w:r>
-      <w:r>
-        <w:t xml:space="preserve">Embedding: Advancing Text Embedding and Reranking Through Foundation Models.”</w:t>
+        <w:t xml:space="preserve">Qwen3 Embedding: Advancing Text Embedding and Reranking Through Foundation Models</w:t>
+      </w:r>
+      <w:r>
+        <w:t xml:space="preserve">.”</w:t>
       </w:r>
       <w:r>
         <w:t xml:space="preserve"> </w:t>
@@ -29753,8 +30688,8 @@
         <w:t xml:space="preserve">arXiv preprint arXiv:2506.05176.</w:t>
       </w:r>
     </w:p>
-    <w:bookmarkEnd w:id="232"/>
-    <w:bookmarkStart w:id="234" w:name="ref-zhao2026design"/>
+    <w:bookmarkEnd w:id="235"/>
+    <w:bookmarkStart w:id="237" w:name="ref-zhao2026design"/>
     <w:p>
       <w:pPr>
         <w:pStyle w:val="Bibliography"/>
@@ -29766,19 +30701,13 @@
         <w:t xml:space="preserve"> </w:t>
       </w:r>
       <w:r>
-        <w:t xml:space="preserve">“Understanding the Fundamental Design Decisions of</w:t>
-      </w:r>
-      <w:r>
-        <w:t xml:space="preserve"> </w:t>
-      </w:r>
-      <w:r>
-        <w:t xml:space="preserve">Retrieval-Augmented</w:t>
-      </w:r>
-      <w:r>
-        <w:t xml:space="preserve"> </w:t>
-      </w:r>
-      <w:r>
-        <w:t xml:space="preserve">Generation Systems.”</w:t>
+        <w:t xml:space="preserve">“</w:t>
+      </w:r>
+      <w:r>
+        <w:t xml:space="preserve">Understanding the Fundamental Design Decisions of Retrieval-Augmented Generation Systems</w:t>
+      </w:r>
+      <w:r>
+        <w:t xml:space="preserve">.”</w:t>
       </w:r>
       <w:r>
         <w:t xml:space="preserve"> </w:t>
@@ -29796,7 +30725,7 @@
       <w:r>
         <w:t xml:space="preserve"> </w:t>
       </w:r>
-      <w:hyperlink r:id="rId233">
+      <w:hyperlink r:id="rId236">
         <w:r>
           <w:rPr>
             <w:rStyle w:val="Hyperlink"/>
@@ -29808,8 +30737,8 @@
         <w:t xml:space="preserve">.</w:t>
       </w:r>
     </w:p>
-    <w:bookmarkEnd w:id="234"/>
-    <w:bookmarkStart w:id="235" w:name="ref-zheng2023judge"/>
+    <w:bookmarkEnd w:id="237"/>
+    <w:bookmarkStart w:id="238" w:name="ref-zheng2023judge"/>
     <w:p>
       <w:pPr>
         <w:pStyle w:val="Bibliography"/>
@@ -29821,31 +30750,13 @@
         <w:t xml:space="preserve"> </w:t>
       </w:r>
       <w:r>
-        <w:t xml:space="preserve">“Judging</w:t>
-      </w:r>
-      <w:r>
-        <w:t xml:space="preserve"> </w:t>
-      </w:r>
-      <w:r>
-        <w:t xml:space="preserve">LLM-as-a-Judge</w:t>
-      </w:r>
-      <w:r>
-        <w:t xml:space="preserve"> </w:t>
-      </w:r>
-      <w:r>
-        <w:t xml:space="preserve">with</w:t>
-      </w:r>
-      <w:r>
-        <w:t xml:space="preserve"> </w:t>
-      </w:r>
-      <w:r>
-        <w:t xml:space="preserve">MT-Bench</w:t>
-      </w:r>
-      <w:r>
-        <w:t xml:space="preserve"> </w:t>
-      </w:r>
-      <w:r>
-        <w:t xml:space="preserve">and Chatbot Arena.”</w:t>
+        <w:t xml:space="preserve">“</w:t>
+      </w:r>
+      <w:r>
+        <w:t xml:space="preserve">Judging LLM-as-a-Judge with MT-Bench and Chatbot Arena</w:t>
+      </w:r>
+      <w:r>
+        <w:t xml:space="preserve">.”</w:t>
       </w:r>
       <w:r>
         <w:t xml:space="preserve"> </w:t>
@@ -29867,9 +30778,9 @@
         <w:t xml:space="preserve">.</w:t>
       </w:r>
     </w:p>
-    <w:bookmarkEnd w:id="235"/>
-    <w:bookmarkEnd w:id="236"/>
-    <w:bookmarkEnd w:id="237"/>
+    <w:bookmarkEnd w:id="238"/>
+    <w:bookmarkEnd w:id="239"/>
+    <w:bookmarkEnd w:id="240"/>
     <w:sectPr/>
   </w:body>
 </w:document>

</xml_diff>

<commit_message>
Data availability: repository link on title page, anonymised statement in manuscript
</commit_message>
<xml_diff>
--- a/manuscript_ipm/latex/manuscript.docx
+++ b/manuscript_ipm/latex/manuscript.docx
@@ -18408,16 +18408,7 @@
         <w:pStyle w:val="FirstParagraph"/>
       </w:pPr>
       <w:r>
-        <w:t xml:space="preserve">All code, prompts, design documents with their registration dates, raw reader outputs, scored answers and analysis scripts are available for review at</w:t>
-      </w:r>
-      <w:r>
-        <w:t xml:space="preserve"> </w:t>
-      </w:r>
-      <w:r>
-        <w:t xml:space="preserve">[[TBD: anonymised repository link, to be inserted by the author before submission]]</w:t>
-      </w:r>
-      <w:r>
-        <w:t xml:space="preserve">. The datasets and models are public under their own licences; the exact revisions are listed in Appendix </w:t>
+        <w:t xml:space="preserve">All code, prompts, design documents with their registration dates, raw reader outputs, scored answers and analysis scripts are kept in one version-controlled repository. To preserve double-anonymised review, its link is given to the editor on the separate title page; it will be made public, with an archived DOI, on acceptance. The datasets and models are public under their own licences; the exact revisions are listed in Appendix </w:t>
       </w:r>
       <w:hyperlink w:anchor="app:repro">
         <w:r>

</xml_diff>

<commit_message>
Edit manuscript prose for clarity and flow
Language-only pass: no change to numbers, citations, claims or terminology.
</commit_message>
<xml_diff>
--- a/manuscript_ipm/latex/manuscript.docx
+++ b/manuscript_ipm/latex/manuscript.docx
@@ -565,13 +565,19 @@
         <w:t xml:space="preserve"> </w:t>
       </w:r>
       <w:r>
-        <w:t xml:space="preserve">intervals</w:t>
+        <w:t xml:space="preserve">intervals,</w:t>
       </w:r>
       <w:r>
         <w:t xml:space="preserve"> </w:t>
       </w:r>
       <w:r>
         <w:t xml:space="preserve">and</w:t>
+      </w:r>
+      <w:r>
+        <w:t xml:space="preserve"> </w:t>
+      </w:r>
+      <w:r>
+        <w:t xml:space="preserve">we</w:t>
       </w:r>
       <w:r>
         <w:t xml:space="preserve"> </w:t>
@@ -1642,7 +1648,7 @@
         <w:pStyle w:val="BodyText"/>
       </w:pPr>
       <w:r>
-        <w:t xml:space="preserve">The question matters most for teams with little compute. A larger encoder costs more to run over a corpus and adds latency to every query. If a retrieval gain turns into a much smaller answer gain, a cheaper encoder may serve as well. Several studies report that retrieval improvements do not reliably improve answers</w:t>
+        <w:t xml:space="preserve">This question matters most for teams with limited compute. A larger encoder costs more to run over a corpus and adds latency to every query. If a retrieval gain turns into a much smaller answer gain, a cheaper encoder may serve as well. Several studies report that retrieval improvements do not reliably improve answers</w:t>
       </w:r>
       <w:r>
         <w:t xml:space="preserve"> </w:t>
@@ -1868,7 +1874,7 @@
         <w:t xml:space="preserve">)</w:t>
       </w:r>
       <w:r>
-        <w:t xml:space="preserve">. They do not report, for a set of interchangeable open encoders, the paired ratio of answer gain to retrieval gain with its uncertainty, per reader and dataset, next to the measured cost of each encoder. This study fills that gap for one well-defined setting.</w:t>
+        <w:t xml:space="preserve">. They do not report, for a set of interchangeable open encoders, the paired ratio of answer gain to retrieval gain with its uncertainty, per reader and dataset, next to the measured cost of each encoder. This study provides such estimates for one well-defined setting.</w:t>
       </w:r>
     </w:p>
     <w:p>
@@ -2029,7 +2035,7 @@
         <w:pStyle w:val="BodyText"/>
       </w:pPr>
       <w:r>
-        <w:t xml:space="preserve">The contributions are as follows.</w:t>
+        <w:t xml:space="preserve">The study makes four contributions.</w:t>
       </w:r>
     </w:p>
     <w:p>
@@ -2441,7 +2447,7 @@
         <w:pStyle w:val="BodyText"/>
       </w:pPr>
       <w:r>
-        <w:t xml:space="preserve">How retrieval scores relate to answer scores is studied in three ways. One correlates retrieval metrics with downstream metrics.</w:t>
+        <w:t xml:space="preserve">Earlier work relates retrieval scores to answer scores in three ways. One line of work correlates retrieval metrics with downstream metrics.</w:t>
       </w:r>
       <w:r>
         <w:t xml:space="preserve"> </w:t>
@@ -2510,7 +2516,7 @@
         <w:t xml:space="preserve"> </w:t>
       </w:r>
       <w:r>
-        <w:t xml:space="preserve">find positive topic- and system-level correlations between coverage-based retrieval metrics and the coverage of generated reports, with weaker links for relevance-based nDCG. A second builds ratios.</w:t>
+        <w:t xml:space="preserve">find positive topic- and system-level correlations between coverage-based retrieval metrics and the coverage of generated reports, with weaker links for relevance-based nDCG. A second line builds ratios.</w:t>
       </w:r>
       <w:r>
         <w:t xml:space="preserve"> </w:t>
@@ -2533,7 +2539,7 @@
         <w:t xml:space="preserve"> </w:t>
       </w:r>
       <w:r>
-        <w:t xml:space="preserve">define a recall conversion rate as answer F1 divided by Recall@5 and report that it falls as recall rises across RAG methods. Their ratio compares levels across different pipelines. Our ratio compares paired gains of interchangeable encoders against one baseline. A third manipulates retrieval directly.</w:t>
+        <w:t xml:space="preserve">define a recall conversion rate as answer F1 divided by Recall@5 and report that it falls as recall rises across RAG methods. Their ratio compares levels across different pipelines. Our ratio compares paired gains of interchangeable encoders against one baseline. A third line manipulates retrieval directly.</w:t>
       </w:r>
       <w:r>
         <w:t xml:space="preserve"> </w:t>
@@ -2659,7 +2665,7 @@
         <w:pStyle w:val="FirstParagraph"/>
       </w:pPr>
       <w:r>
-        <w:t xml:space="preserve">Readers react to the passages next to the gold one.</w:t>
+        <w:t xml:space="preserve">Readers are sensitive to the passages placed next to the gold passage.</w:t>
       </w:r>
       <w:r>
         <w:t xml:space="preserve"> </w:t>
@@ -4663,7 +4669,7 @@
         <w:t xml:space="preserve"> </w:t>
       </w:r>
       <w:r>
-        <w:t xml:space="preserve">would equal the baseline gap. The second term shows how far the encoder also changes how useful its hits and misses are. This decomposition was not part of the registered analysis; we report it as a post hoc description.</w:t>
+        <w:t xml:space="preserve">would equal the baseline gap. The second term measures how far the encoder also changes the usefulness of its hits and misses. This decomposition was not part of the registered analysis; we report it as a post hoc description.</w:t>
       </w:r>
     </w:p>
     <w:bookmarkEnd w:id="30"/>
@@ -6545,7 +6551,7 @@
         <w:t xml:space="preserve"> </w:t>
       </w:r>
       <w:r>
-        <w:t xml:space="preserve">gives the intervals. On NQ, the dense encoders spread widely. MiniLM-L6 reached 0.664 and e5-base-v2 0.816; bge-large (0.796) came second. Qwen3-Embedding-0.6B (0.744) placed between bge-small and bge-base. BM25 reached 0.363. On HotpotQA, Hit@5 nearly saturated: all dense encoders except MiniLM-L6 scored between 0.945 and 0.961, against 0.817 for MiniLM-L6 and 0.833 for BM25. The stricter Both@5 separated them more clearly: bge-large found both supporting passages for 0.621 of the questions, e5-base-v2 for 0.544, Qwen3-Embedding-0.6B for 0.444 and MiniLM-L6 for 0.230. Table </w:t>
+        <w:t xml:space="preserve">gives the intervals. On NQ, the dense encoders differed widely. MiniLM-L6 reached 0.664 and e5-base-v2 0.816; bge-large (0.796) came second. Qwen3-Embedding-0.6B (0.744) placed between bge-small and bge-base. BM25 reached 0.363. On HotpotQA, Hit@5 nearly saturated: all dense encoders except MiniLM-L6 scored between 0.945 and 0.961, against 0.817 for MiniLM-L6 and 0.833 for BM25. The stricter Both@5 separated them more clearly: bge-large found both supporting passages for 0.621 of the questions, e5-base-v2 for 0.544, Qwen3-Embedding-0.6B for 0.444 and MiniLM-L6 for 0.230. Table </w:t>
       </w:r>
       <w:hyperlink w:anchor="tab:retrieval">
         <w:r>
@@ -10083,7 +10089,7 @@
         <w:t xml:space="preserve"> </w:t>
       </w:r>
       <w:r>
-        <w:t xml:space="preserve">= 1.00 and 1.00); against Hit@5 it was 0.96 and 0.96. Bridge questions drove this. With Qwen, bridge EM rose from 0.248 (MiniLM-L6) to 0.384 (bge-large), while comparison EM moved from 0.539 to 0.594, close to its gold bound of 0.654.</w:t>
+        <w:t xml:space="preserve">= 1.00 and 1.00); against Hit@5 it was 0.96 and 0.96. The pattern came mainly from bridge questions. With Qwen, bridge EM rose from 0.248 (MiniLM-L6) to 0.384 (bge-large), while comparison EM moved from 0.539 to 0.594, close to its gold bound of 0.654.</w:t>
       </w:r>
     </w:p>
     <w:p>
@@ -17738,7 +17744,7 @@
         <w:pStyle w:val="FirstParagraph"/>
       </w:pPr>
       <w:r>
-        <w:t xml:space="preserve">On single-hop NQ, a retrieval gain over a small encoder reached the answer at a rate of 0.16 to 0.27 EM points per Hit@5 point, with both readers. Three observations within our setup are consistent with this. One: the readers fell well short of their gold-passage bound even with good retrieval, so part of the loss lies in reading, not retrieval. Two: EM given a miss stayed far above closed-book EM. The NQ relevance labels are sparse, so many</w:t>
+        <w:t xml:space="preserve">On single-hop NQ, a retrieval gain over a small encoder reached the answer at a rate of 0.16 to 0.27 EM points per Hit@5 point, with both readers. Three observations within our setup are consistent with this. (i) The readers fell well short of their gold-passage bound even with good retrieval, so part of the loss lies in reading, not retrieval. (ii) EM given a miss stayed far above closed-book EM. The NQ relevance labels are sparse, so many</w:t>
       </w:r>
       <w:r>
         <w:t xml:space="preserve"> </w:t>
@@ -17756,7 +17762,7 @@
         <w:t xml:space="preserve"> </w:t>
       </w:r>
       <w:r>
-        <w:t xml:space="preserve">likely still contained an answer-bearing passage that was not labelled gold, or the reader knew the answer. Hit@5 may therefore overstate the difference between encoders that matters for the reader. Three: EM given a hit fell slightly as encoders improved: the questions that a better encoder newly solves at the retrieval stage seem harder to answer. This last point is a hypothesis; we did not test which questions changed status.</w:t>
+        <w:t xml:space="preserve">likely still contained an answer-bearing passage that was not labelled gold, or the reader knew the answer. Hit@5 may therefore overstate the difference between encoders that matters for the reader. (iii) EM given a hit fell slightly as encoders improved, which suggests that the questions that a better encoder newly solves at the retrieval stage are harder to answer. This last point is a hypothesis; we did not test which questions changed status.</w:t>
       </w:r>
     </w:p>
     <w:p>
@@ -17772,7 +17778,7 @@
         <w:pStyle w:val="BodyText"/>
       </w:pPr>
       <w:r>
-        <w:t xml:space="preserve">The two datasets therefore support different conclusions about the same encoders. A team that judges encoders by single-hop retrieval benchmarks may overrate the answer value of the strongest ones. A team with multi-hop questions may underrate it if it uses Hit@k.</w:t>
+        <w:t xml:space="preserve">The two datasets thus support different conclusions about the same encoders. A team that judges encoders by single-hop retrieval benchmarks may overrate the answer value of the strongest ones. A team with multi-hop questions may underrate it if it uses Hit@k.</w:t>
       </w:r>
     </w:p>
     <w:bookmarkEnd w:id="110"/>
@@ -18308,7 +18314,7 @@
         <w:pStyle w:val="BodyText"/>
       </w:pPr>
       <w:r>
-        <w:t xml:space="preserve">Within this setup, retrieval benchmarks overstate the answer value of stronger encoders on single-hop questions, and Hit@k understates it on multi-hop questions. We recommend that RAG studies report answer gains next to retrieval gains, with paired intervals, and use retrieval metrics that require all evidence a question needs. Future work should test larger readers, other domains and a full corpus for the readers, and should replace EM with validated human or model judgements.</w:t>
+        <w:t xml:space="preserve">Within this setup, retrieval benchmarks overstate the answer value of stronger encoders on single-hop questions, and Hit@k understates it on multi-hop questions. We recommend that RAG studies report answer gains next to retrieval gains, with paired intervals, and use retrieval metrics that require all evidence a question needs. Future work should test larger readers and other domains, run the readers on the full corpus, and replace EM with validated human or model judgements.</w:t>
       </w:r>
     </w:p>
     <w:bookmarkEnd w:id="122"/>

</xml_diff>